<commit_message>
cand motion-brief: typst and docx re-rendered from the pleading-paper template (the committed outputs predated it: DEF-CONT-001 and DEF-FORM-002 read their old footer under the 60 pt margin); DEF-COVER-002 accepts the title re-wrapped in the 1.5 in page's right column; typst 11/11, docx 15/15 (fb-595.88)
Co-Authored-By: Claude Opus 5.5 <noreply@anthropic.com>
Gate: fb-595-88-a1 d4792daf87f1c08fe9fb2a3bfbd6aaacdf6896c9
</commit_message>
<xml_diff>
--- a/courts/ninth-circuit/california/federal/northern-district/motion-brief/usage/OUTPUT-motion-brief.docx
+++ b/courts/ninth-circuit/california/federal/northern-district/motion-brief/usage/OUTPUT-motion-brief.docx
@@ -4,7 +4,7 @@
   <w:body>
     <w:p>
       <w:pPr>
-        <w:spacing w:before="0" w:after="0" w:line="276" w:lineRule="exact"/>
+        <w:spacing w:before="0" w:after="0" w:line="240" w:lineRule="exact"/>
         <w:ind w:left="0" w:firstLine="0"/>
         <w:jc w:val="left"/>
       </w:pPr>
@@ -38,7 +38,7 @@
     </w:p>
     <w:p>
       <w:pPr>
-        <w:spacing w:before="0" w:after="0" w:line="276" w:lineRule="exact"/>
+        <w:spacing w:before="0" w:after="0" w:line="240" w:lineRule="exact"/>
         <w:ind w:left="0" w:firstLine="0"/>
         <w:jc w:val="left"/>
       </w:pPr>
@@ -60,7 +60,7 @@
     </w:p>
     <w:p>
       <w:pPr>
-        <w:spacing w:before="0" w:after="0" w:line="276" w:lineRule="exact"/>
+        <w:spacing w:before="0" w:after="0" w:line="240" w:lineRule="exact"/>
         <w:ind w:left="0" w:firstLine="0"/>
         <w:jc w:val="left"/>
       </w:pPr>
@@ -88,7 +88,7 @@
     </w:p>
     <w:p>
       <w:pPr>
-        <w:spacing w:before="0" w:after="0" w:line="276" w:lineRule="exact"/>
+        <w:spacing w:before="0" w:after="0" w:line="240" w:lineRule="exact"/>
         <w:ind w:left="0" w:firstLine="0"/>
         <w:jc w:val="left"/>
       </w:pPr>
@@ -110,7 +110,7 @@
     </w:p>
     <w:p>
       <w:pPr>
-        <w:spacing w:before="0" w:after="0" w:line="276" w:lineRule="exact"/>
+        <w:spacing w:before="0" w:after="0" w:line="240" w:lineRule="exact"/>
         <w:ind w:left="0" w:firstLine="0"/>
         <w:jc w:val="left"/>
       </w:pPr>
@@ -138,7 +138,7 @@
     </w:p>
     <w:p>
       <w:pPr>
-        <w:spacing w:before="0" w:after="0" w:line="276" w:lineRule="exact"/>
+        <w:spacing w:before="0" w:after="0" w:line="240" w:lineRule="exact"/>
         <w:ind w:left="0" w:firstLine="0"/>
         <w:jc w:val="left"/>
       </w:pPr>
@@ -166,7 +166,7 @@
     </w:p>
     <w:p>
       <w:pPr>
-        <w:spacing w:before="0" w:after="0" w:line="276" w:lineRule="exact"/>
+        <w:spacing w:before="0" w:after="0" w:line="240" w:lineRule="exact"/>
         <w:ind w:left="0" w:firstLine="0"/>
         <w:jc w:val="left"/>
       </w:pPr>
@@ -206,7 +206,7 @@
     </w:p>
     <w:p>
       <w:pPr>
-        <w:spacing w:before="0" w:after="0" w:line="276" w:lineRule="exact"/>
+        <w:spacing w:before="0" w:after="0" w:line="240" w:lineRule="exact"/>
         <w:ind w:left="0" w:firstLine="0"/>
         <w:jc w:val="left"/>
       </w:pPr>
@@ -229,14 +229,12 @@
         <w:t xml:space="preserve"> </w:t>
       </w:r>
       <w:r>
-        <w:t xml:space="preserve">94102</w:t>
-        <w:noBreakHyphen/>
-        <w:t xml:space="preserve">3495</w:t>
-      </w:r>
-    </w:p>
-    <w:p>
-      <w:pPr>
-        <w:spacing w:before="0" w:after="0" w:line="276" w:lineRule="exact"/>
+        <w:t xml:space="preserve">94102-⁠3495</w:t>
+      </w:r>
+    </w:p>
+    <w:p>
+      <w:pPr>
+        <w:spacing w:before="0" w:after="0" w:line="240" w:lineRule="exact"/>
         <w:ind w:left="0" w:firstLine="0"/>
         <w:jc w:val="left"/>
       </w:pPr>
@@ -253,14 +251,12 @@
         <w:t xml:space="preserve"> </w:t>
       </w:r>
       <w:r>
-        <w:t xml:space="preserve">436</w:t>
-        <w:noBreakHyphen/>
-        <w:t xml:space="preserve">7180</w:t>
-      </w:r>
-    </w:p>
-    <w:p>
-      <w:pPr>
-        <w:spacing w:before="0" w:after="0" w:line="276" w:lineRule="exact"/>
+        <w:t xml:space="preserve">436-⁠7180</w:t>
+      </w:r>
+    </w:p>
+    <w:p>
+      <w:pPr>
+        <w:spacing w:before="0" w:after="0" w:line="240" w:lineRule="exact"/>
         <w:ind w:left="0" w:firstLine="0"/>
         <w:jc w:val="left"/>
       </w:pPr>
@@ -277,14 +273,12 @@
         <w:t xml:space="preserve"> </w:t>
       </w:r>
       <w:r>
-        <w:t xml:space="preserve">436</w:t>
-        <w:noBreakHyphen/>
-        <w:t xml:space="preserve">6748</w:t>
-      </w:r>
-    </w:p>
-    <w:p>
-      <w:pPr>
-        <w:spacing w:before="0" w:after="0" w:line="276" w:lineRule="exact"/>
+        <w:t xml:space="preserve">436-⁠6748</w:t>
+      </w:r>
+    </w:p>
+    <w:p>
+      <w:pPr>
+        <w:spacing w:before="0" w:after="0" w:line="240" w:lineRule="exact"/>
         <w:ind w:left="0" w:firstLine="0"/>
         <w:jc w:val="left"/>
       </w:pPr>
@@ -294,7 +288,7 @@
     </w:p>
     <w:p>
       <w:pPr>
-        <w:spacing w:before="0" w:after="0" w:line="276" w:lineRule="exact"/>
+        <w:spacing w:before="0" w:after="0" w:line="240" w:lineRule="exact"/>
         <w:ind w:left="0" w:firstLine="0"/>
         <w:jc w:val="left"/>
       </w:pPr>
@@ -350,7 +344,7 @@
     </w:p>
     <w:p>
       <w:pPr>
-        <w:spacing w:before="480" w:after="0" w:line="276" w:lineRule="exact"/>
+        <w:spacing w:before="480" w:after="0" w:line="240" w:lineRule="exact"/>
         <w:ind w:left="0" w:firstLine="0"/>
         <w:jc w:val="center"/>
       </w:pPr>
@@ -406,7 +400,7 @@
     </w:p>
     <w:p>
       <w:pPr>
-        <w:spacing w:before="0" w:after="0" w:line="276" w:lineRule="exact"/>
+        <w:spacing w:before="0" w:after="0" w:line="240" w:lineRule="exact"/>
         <w:ind w:left="0" w:firstLine="0"/>
         <w:jc w:val="center"/>
       </w:pPr>
@@ -462,7 +456,7 @@
     </w:p>
     <w:p>
       <w:pPr>
-        <w:spacing w:before="0" w:after="0" w:line="276" w:lineRule="exact"/>
+        <w:spacing w:before="0" w:after="0" w:line="240" w:lineRule="exact"/>
         <w:ind w:left="0" w:firstLine="0"/>
         <w:jc w:val="center"/>
       </w:pPr>
@@ -511,7 +505,7 @@
     </w:p>
     <w:tbl>
       <w:tblPr>
-        <w:tblW w:w="9360" w:type="dxa"/>
+        <w:tblW w:w="8640" w:type="dxa"/>
         <w:tblLayout w:type="fixed"/>
         <w:tblCellMar>
           <w:top w:w="0" w:type="dxa"/>
@@ -522,8 +516,8 @@
         <w:tblLook w:val="0000" w:firstRow="0" w:lastRow="0" w:firstColumn="0" w:lastColumn="0" w:noHBand="0" w:noVBand="0"/>
       </w:tblPr>
       <w:tblGrid>
-        <w:gridCol w:w="4680"/>
-        <w:gridCol w:w="4680"/>
+        <w:gridCol w:w="4320"/>
+        <w:gridCol w:w="4320"/>
       </w:tblGrid>
       <w:tr>
         <w:trPr>
@@ -531,7 +525,7 @@
         </w:trPr>
         <w:tc>
           <w:tcPr>
-            <w:tcW w:w="4680" w:type="dxa"/>
+            <w:tcW w:w="4320" w:type="dxa"/>
             <w:tcBorders>
               <w:bottom w:val="single" w:sz="6" w:space="0" w:color="000000"/>
               <w:right w:val="single" w:sz="6" w:space="0" w:color="000000"/>
@@ -543,7 +537,7 @@
           </w:tcPr>
           <w:p>
             <w:pPr>
-              <w:spacing w:before="0" w:after="0" w:line="276" w:lineRule="exact"/>
+              <w:spacing w:before="0" w:after="0" w:line="240" w:lineRule="exact"/>
               <w:ind w:left="0" w:firstLine="0"/>
               <w:jc w:val="left"/>
             </w:pPr>
@@ -583,7 +577,7 @@
           </w:p>
           <w:p>
             <w:pPr>
-              <w:spacing w:before="0" w:after="0" w:line="276" w:lineRule="exact"/>
+              <w:spacing w:before="0" w:after="0" w:line="240" w:lineRule="exact"/>
               <w:ind w:left="2592" w:firstLine="0"/>
               <w:jc w:val="left"/>
             </w:pPr>
@@ -593,7 +587,7 @@
           </w:p>
           <w:p>
             <w:pPr>
-              <w:spacing w:before="240" w:after="0" w:line="276" w:lineRule="exact"/>
+              <w:spacing w:before="240" w:after="0" w:line="240" w:lineRule="exact"/>
               <w:ind w:left="0" w:firstLine="0"/>
               <w:jc w:val="center"/>
             </w:pPr>
@@ -603,7 +597,7 @@
           </w:p>
           <w:p>
             <w:pPr>
-              <w:spacing w:before="240" w:after="0" w:line="276" w:lineRule="exact"/>
+              <w:spacing w:before="240" w:after="0" w:line="240" w:lineRule="exact"/>
               <w:ind w:left="0" w:firstLine="0"/>
               <w:jc w:val="left"/>
             </w:pPr>
@@ -859,7 +853,7 @@
           </w:p>
           <w:p>
             <w:pPr>
-              <w:spacing w:before="0" w:after="0" w:line="276" w:lineRule="exact"/>
+              <w:spacing w:before="0" w:after="0" w:line="240" w:lineRule="exact"/>
               <w:ind w:left="2592" w:firstLine="0"/>
               <w:jc w:val="left"/>
             </w:pPr>
@@ -870,26 +864,24 @@
         </w:tc>
         <w:tc>
           <w:tcPr>
-            <w:tcW w:w="4680" w:type="dxa"/>
+            <w:tcW w:w="4320" w:type="dxa"/>
             <w:tcMar>
               <w:left w:w="288" w:type="dxa"/>
             </w:tcMar>
           </w:tcPr>
           <w:p>
             <w:pPr>
-              <w:spacing w:before="72" w:after="0" w:line="276" w:lineRule="exact"/>
+              <w:spacing w:before="72" w:after="0" w:line="240" w:lineRule="exact"/>
               <w:ind w:left="0" w:firstLine="0"/>
               <w:jc w:val="left"/>
             </w:pPr>
             <w:r>
-              <w:t xml:space="preserve">Case No. 16-cv</w:t>
-              <w:noBreakHyphen/>
-              <w:t xml:space="preserve">7189-LB</w:t>
+              <w:t xml:space="preserve">Case No. 16-cv-⁠7189-LB</w:t>
             </w:r>
           </w:p>
           <w:p>
             <w:pPr>
-              <w:spacing w:before="240" w:after="0" w:line="276" w:lineRule="exact"/>
+              <w:spacing w:before="240" w:after="0" w:line="240" w:lineRule="exact"/>
               <w:ind w:left="0" w:firstLine="0"/>
               <w:jc w:val="left"/>
             </w:pPr>
@@ -1183,7 +1175,7 @@
           </w:p>
           <w:p>
             <w:pPr>
-              <w:spacing w:before="240" w:after="0" w:line="276" w:lineRule="exact"/>
+              <w:spacing w:before="240" w:after="0" w:line="240" w:lineRule="exact"/>
               <w:ind w:left="0" w:firstLine="0"/>
               <w:jc w:val="left"/>
             </w:pPr>
@@ -1214,7 +1206,7 @@
           </w:p>
           <w:p>
             <w:pPr>
-              <w:spacing w:before="0" w:after="0" w:line="276" w:lineRule="exact"/>
+              <w:spacing w:before="0" w:after="0" w:line="240" w:lineRule="exact"/>
               <w:ind w:left="0" w:firstLine="0"/>
               <w:jc w:val="left"/>
             </w:pPr>
@@ -1233,7 +1225,7 @@
           </w:p>
           <w:p>
             <w:pPr>
-              <w:spacing w:before="0" w:after="0" w:line="276" w:lineRule="exact"/>
+              <w:spacing w:before="0" w:after="0" w:line="240" w:lineRule="exact"/>
               <w:ind w:left="0" w:firstLine="0"/>
               <w:jc w:val="left"/>
             </w:pPr>
@@ -1264,7 +1256,7 @@
           </w:p>
           <w:p>
             <w:pPr>
-              <w:spacing w:before="0" w:after="0" w:line="276" w:lineRule="exact"/>
+              <w:spacing w:before="0" w:after="0" w:line="240" w:lineRule="exact"/>
               <w:ind w:left="0" w:firstLine="0"/>
               <w:jc w:val="left"/>
             </w:pPr>
@@ -1291,9 +1283,9 @@
       <w:pPr>
         <w:spacing w:before="0" w:after="0" w:line="20" w:lineRule="exact"/>
         <w:sectPr>
-          <w:footerReference w:type="default" r:id="rIdFtrNone"/>
+          <w:footerReference w:type="default" r:id="rIdCandCover"/>
           <w:pgSz w:w="12240" w:h="15840"/>
-          <w:pgMar w:top="1440" w:right="1440" w:bottom="1440" w:left="1440" w:header="720" w:footer="360" w:gutter="0"/>
+          <w:pgMar w:top="1200" w:right="1440" w:bottom="1200" w:left="2160" w:header="720" w:footer="160" w:gutter="0"/>
         </w:sectPr>
       </w:pPr>
     </w:p>
@@ -1301,7 +1293,7 @@
       <w:pPr>
         <w:keepNext/>
         <w:keepLines/>
-        <w:spacing w:before="0" w:after="0" w:line="276" w:lineRule="exact"/>
+        <w:spacing w:before="0" w:after="0" w:line="240" w:lineRule="exact"/>
         <w:ind w:left="0" w:firstLine="0"/>
         <w:jc w:val="center"/>
       </w:pPr>
@@ -1317,7 +1309,7 @@
       <w:pPr>
         <w:keepNext/>
         <w:keepLines/>
-        <w:spacing w:before="240" w:after="0" w:line="276" w:lineRule="exact"/>
+        <w:spacing w:before="240" w:after="0" w:line="240" w:lineRule="exact"/>
         <w:ind w:left="0" w:firstLine="0"/>
         <w:jc w:val="right"/>
       </w:pPr>
@@ -1334,9 +1326,9 @@
         <w:keepLines/>
         <w:tabs>
           <w:tab w:val="left" w:pos="720"/>
-          <w:tab w:val="right" w:leader="dot" w:pos="9360"/>
+          <w:tab w:val="right" w:leader="dot" w:pos="8640"/>
         </w:tabs>
-        <w:spacing w:before="120" w:after="0" w:line="276" w:lineRule="exact"/>
+        <w:spacing w:before="120" w:after="0" w:line="240" w:lineRule="exact"/>
         <w:ind w:left="720" w:right="720" w:hanging="720"/>
         <w:jc w:val="left"/>
       </w:pPr>
@@ -1370,9 +1362,9 @@
         <w:keepLines/>
         <w:tabs>
           <w:tab w:val="left" w:pos="720"/>
-          <w:tab w:val="right" w:leader="dot" w:pos="9360"/>
+          <w:tab w:val="right" w:leader="dot" w:pos="8640"/>
         </w:tabs>
-        <w:spacing w:before="120" w:after="0" w:line="276" w:lineRule="exact"/>
+        <w:spacing w:before="120" w:after="0" w:line="240" w:lineRule="exact"/>
         <w:ind w:left="720" w:right="720" w:hanging="720"/>
         <w:jc w:val="left"/>
       </w:pPr>
@@ -1400,9 +1392,9 @@
         <w:keepLines/>
         <w:tabs>
           <w:tab w:val="left" w:pos="720"/>
-          <w:tab w:val="right" w:leader="dot" w:pos="9360"/>
+          <w:tab w:val="right" w:leader="dot" w:pos="8640"/>
         </w:tabs>
-        <w:spacing w:before="120" w:after="0" w:line="276" w:lineRule="exact"/>
+        <w:spacing w:before="120" w:after="0" w:line="240" w:lineRule="exact"/>
         <w:ind w:left="720" w:right="720" w:hanging="720"/>
         <w:jc w:val="left"/>
       </w:pPr>
@@ -1442,9 +1434,9 @@
         <w:keepLines/>
         <w:tabs>
           <w:tab w:val="left" w:pos="720"/>
-          <w:tab w:val="right" w:leader="dot" w:pos="9360"/>
+          <w:tab w:val="right" w:leader="dot" w:pos="8640"/>
         </w:tabs>
-        <w:spacing w:before="120" w:after="0" w:line="276" w:lineRule="exact"/>
+        <w:spacing w:before="120" w:after="0" w:line="240" w:lineRule="exact"/>
         <w:ind w:left="720" w:right="720" w:hanging="720"/>
         <w:jc w:val="left"/>
       </w:pPr>
@@ -1490,9 +1482,9 @@
         <w:keepLines/>
         <w:tabs>
           <w:tab w:val="left" w:pos="720"/>
-          <w:tab w:val="right" w:leader="dot" w:pos="9360"/>
+          <w:tab w:val="right" w:leader="dot" w:pos="8640"/>
         </w:tabs>
-        <w:spacing w:before="120" w:after="0" w:line="276" w:lineRule="exact"/>
+        <w:spacing w:before="120" w:after="0" w:line="240" w:lineRule="exact"/>
         <w:ind w:left="720" w:right="720" w:hanging="720"/>
         <w:jc w:val="left"/>
       </w:pPr>
@@ -1520,9 +1512,9 @@
         <w:keepLines/>
         <w:tabs>
           <w:tab w:val="left" w:pos="720"/>
-          <w:tab w:val="right" w:leader="dot" w:pos="9360"/>
+          <w:tab w:val="right" w:leader="dot" w:pos="8640"/>
         </w:tabs>
-        <w:spacing w:before="120" w:after="0" w:line="276" w:lineRule="exact"/>
+        <w:spacing w:before="120" w:after="0" w:line="240" w:lineRule="exact"/>
         <w:ind w:left="720" w:right="720" w:hanging="720"/>
         <w:jc w:val="left"/>
       </w:pPr>
@@ -1556,9 +1548,9 @@
         <w:keepLines/>
         <w:tabs>
           <w:tab w:val="left" w:pos="720"/>
-          <w:tab w:val="right" w:leader="dot" w:pos="9360"/>
+          <w:tab w:val="right" w:leader="dot" w:pos="8640"/>
         </w:tabs>
-        <w:spacing w:before="120" w:after="0" w:line="276" w:lineRule="exact"/>
+        <w:spacing w:before="120" w:after="0" w:line="240" w:lineRule="exact"/>
         <w:ind w:left="720" w:right="720" w:hanging="720"/>
         <w:jc w:val="left"/>
       </w:pPr>
@@ -1586,9 +1578,9 @@
         <w:keepLines/>
         <w:tabs>
           <w:tab w:val="left" w:pos="1440"/>
-          <w:tab w:val="right" w:leader="dot" w:pos="9360"/>
+          <w:tab w:val="right" w:leader="dot" w:pos="8640"/>
         </w:tabs>
-        <w:spacing w:before="120" w:after="0" w:line="276" w:lineRule="exact"/>
+        <w:spacing w:before="120" w:after="0" w:line="240" w:lineRule="exact"/>
         <w:ind w:left="1440" w:right="720" w:hanging="720"/>
         <w:jc w:val="left"/>
       </w:pPr>
@@ -1712,9 +1704,9 @@
         <w:keepLines/>
         <w:tabs>
           <w:tab w:val="left" w:pos="2160"/>
-          <w:tab w:val="right" w:leader="dot" w:pos="9360"/>
+          <w:tab w:val="right" w:leader="dot" w:pos="8640"/>
         </w:tabs>
-        <w:spacing w:before="120" w:after="0" w:line="276" w:lineRule="exact"/>
+        <w:spacing w:before="120" w:after="0" w:line="240" w:lineRule="exact"/>
         <w:ind w:left="2160" w:right="720" w:hanging="720"/>
         <w:jc w:val="left"/>
       </w:pPr>
@@ -1748,9 +1740,9 @@
         <w:keepLines/>
         <w:tabs>
           <w:tab w:val="left" w:pos="2160"/>
-          <w:tab w:val="right" w:leader="dot" w:pos="9360"/>
+          <w:tab w:val="right" w:leader="dot" w:pos="8640"/>
         </w:tabs>
-        <w:spacing w:before="120" w:after="0" w:line="276" w:lineRule="exact"/>
+        <w:spacing w:before="120" w:after="0" w:line="240" w:lineRule="exact"/>
         <w:ind w:left="2160" w:right="720" w:hanging="720"/>
         <w:jc w:val="left"/>
       </w:pPr>
@@ -1838,9 +1830,9 @@
         <w:keepLines/>
         <w:tabs>
           <w:tab w:val="left" w:pos="2160"/>
-          <w:tab w:val="right" w:leader="dot" w:pos="9360"/>
+          <w:tab w:val="right" w:leader="dot" w:pos="8640"/>
         </w:tabs>
-        <w:spacing w:before="120" w:after="0" w:line="276" w:lineRule="exact"/>
+        <w:spacing w:before="120" w:after="0" w:line="240" w:lineRule="exact"/>
         <w:ind w:left="2160" w:right="720" w:hanging="720"/>
         <w:jc w:val="left"/>
       </w:pPr>
@@ -1916,9 +1908,9 @@
         <w:keepLines/>
         <w:tabs>
           <w:tab w:val="left" w:pos="1440"/>
-          <w:tab w:val="right" w:leader="dot" w:pos="9360"/>
+          <w:tab w:val="right" w:leader="dot" w:pos="8640"/>
         </w:tabs>
-        <w:spacing w:before="120" w:after="0" w:line="276" w:lineRule="exact"/>
+        <w:spacing w:before="120" w:after="0" w:line="240" w:lineRule="exact"/>
         <w:ind w:left="1440" w:right="720" w:hanging="720"/>
         <w:jc w:val="left"/>
       </w:pPr>
@@ -2018,9 +2010,9 @@
         <w:keepLines/>
         <w:tabs>
           <w:tab w:val="left" w:pos="2160"/>
-          <w:tab w:val="right" w:leader="dot" w:pos="9360"/>
+          <w:tab w:val="right" w:leader="dot" w:pos="8640"/>
         </w:tabs>
-        <w:spacing w:before="120" w:after="0" w:line="276" w:lineRule="exact"/>
+        <w:spacing w:before="120" w:after="0" w:line="240" w:lineRule="exact"/>
         <w:ind w:left="2160" w:right="720" w:hanging="720"/>
         <w:jc w:val="left"/>
       </w:pPr>
@@ -2054,9 +2046,9 @@
         <w:keepLines/>
         <w:tabs>
           <w:tab w:val="left" w:pos="720"/>
-          <w:tab w:val="right" w:leader="dot" w:pos="9360"/>
+          <w:tab w:val="right" w:leader="dot" w:pos="8640"/>
         </w:tabs>
-        <w:spacing w:before="120" w:after="0" w:line="276" w:lineRule="exact"/>
+        <w:spacing w:before="120" w:after="0" w:line="240" w:lineRule="exact"/>
         <w:ind w:left="720" w:right="720" w:hanging="720"/>
         <w:jc w:val="left"/>
       </w:pPr>
@@ -2078,7 +2070,7 @@
         <w:keepNext/>
         <w:keepLines/>
         <w:pageBreakBefore/>
-        <w:spacing w:before="0" w:after="0" w:line="276" w:lineRule="exact"/>
+        <w:spacing w:before="0" w:after="0" w:line="240" w:lineRule="exact"/>
         <w:ind w:left="0" w:firstLine="0"/>
         <w:jc w:val="center"/>
       </w:pPr>
@@ -2094,7 +2086,7 @@
       <w:pPr>
         <w:keepNext/>
         <w:keepLines/>
-        <w:spacing w:before="240" w:after="0" w:line="276" w:lineRule="exact"/>
+        <w:spacing w:before="240" w:after="0" w:line="240" w:lineRule="exact"/>
         <w:ind w:left="0" w:firstLine="0"/>
         <w:jc w:val="right"/>
       </w:pPr>
@@ -2110,7 +2102,7 @@
       <w:pPr>
         <w:keepNext/>
         <w:keepLines/>
-        <w:spacing w:before="240" w:after="0" w:line="276" w:lineRule="exact"/>
+        <w:spacing w:before="240" w:after="0" w:line="240" w:lineRule="exact"/>
         <w:ind w:left="0" w:firstLine="0"/>
         <w:jc w:val="left"/>
       </w:pPr>
@@ -2126,9 +2118,9 @@
       <w:pPr>
         <w:keepLines/>
         <w:tabs>
-          <w:tab w:val="right" w:leader="dot" w:pos="9360"/>
+          <w:tab w:val="right" w:leader="dot" w:pos="8640"/>
         </w:tabs>
-        <w:spacing w:before="120" w:after="0" w:line="276" w:lineRule="exact"/>
+        <w:spacing w:before="120" w:after="0" w:line="240" w:lineRule="exact"/>
         <w:ind w:left="504" w:right="1440" w:hanging="504"/>
         <w:jc w:val="left"/>
       </w:pPr>
@@ -2267,9 +2259,7 @@
         <w:t xml:space="preserve"> </w:t>
       </w:r>
       <w:r>
-        <w:t xml:space="preserve">12</w:t>
-        <w:noBreakHyphen/>
-        <w:t xml:space="preserve">4407-SC,</w:t>
+        <w:t xml:space="preserve">12-⁠4407-SC,</w:t>
       </w:r>
       <w:r>
         <w:t xml:space="preserve"> </w:t>
@@ -2333,9 +2323,9 @@
       <w:pPr>
         <w:keepLines/>
         <w:tabs>
-          <w:tab w:val="right" w:leader="dot" w:pos="9360"/>
+          <w:tab w:val="right" w:leader="dot" w:pos="8640"/>
         </w:tabs>
-        <w:spacing w:before="120" w:after="0" w:line="276" w:lineRule="exact"/>
+        <w:spacing w:before="120" w:after="0" w:line="240" w:lineRule="exact"/>
         <w:ind w:left="504" w:right="1440" w:hanging="504"/>
         <w:jc w:val="left"/>
       </w:pPr>
@@ -2412,9 +2402,9 @@
       <w:pPr>
         <w:keepLines/>
         <w:tabs>
-          <w:tab w:val="right" w:leader="dot" w:pos="9360"/>
+          <w:tab w:val="right" w:leader="dot" w:pos="8640"/>
         </w:tabs>
-        <w:spacing w:before="120" w:after="0" w:line="276" w:lineRule="exact"/>
+        <w:spacing w:before="120" w:after="0" w:line="240" w:lineRule="exact"/>
         <w:ind w:left="504" w:right="1440" w:hanging="504"/>
         <w:jc w:val="left"/>
       </w:pPr>
@@ -2531,9 +2521,9 @@
       <w:pPr>
         <w:keepLines/>
         <w:tabs>
-          <w:tab w:val="right" w:leader="dot" w:pos="9360"/>
+          <w:tab w:val="right" w:leader="dot" w:pos="8640"/>
         </w:tabs>
-        <w:spacing w:before="120" w:after="0" w:line="276" w:lineRule="exact"/>
+        <w:spacing w:before="120" w:after="0" w:line="240" w:lineRule="exact"/>
         <w:ind w:left="504" w:right="1440" w:hanging="504"/>
         <w:jc w:val="left"/>
       </w:pPr>
@@ -2638,9 +2628,9 @@
       <w:pPr>
         <w:keepLines/>
         <w:tabs>
-          <w:tab w:val="right" w:leader="dot" w:pos="9360"/>
+          <w:tab w:val="right" w:leader="dot" w:pos="8640"/>
         </w:tabs>
-        <w:spacing w:before="120" w:after="0" w:line="276" w:lineRule="exact"/>
+        <w:spacing w:before="120" w:after="0" w:line="240" w:lineRule="exact"/>
         <w:ind w:left="504" w:right="1440" w:hanging="504"/>
         <w:jc w:val="left"/>
       </w:pPr>
@@ -2757,9 +2747,9 @@
       <w:pPr>
         <w:keepLines/>
         <w:tabs>
-          <w:tab w:val="right" w:leader="dot" w:pos="9360"/>
+          <w:tab w:val="right" w:leader="dot" w:pos="8640"/>
         </w:tabs>
-        <w:spacing w:before="120" w:after="0" w:line="276" w:lineRule="exact"/>
+        <w:spacing w:before="120" w:after="0" w:line="240" w:lineRule="exact"/>
         <w:ind w:left="504" w:right="1440" w:hanging="504"/>
         <w:jc w:val="left"/>
       </w:pPr>
@@ -2848,9 +2838,9 @@
       <w:pPr>
         <w:keepLines/>
         <w:tabs>
-          <w:tab w:val="right" w:leader="dot" w:pos="9360"/>
+          <w:tab w:val="right" w:leader="dot" w:pos="8640"/>
         </w:tabs>
-        <w:spacing w:before="120" w:after="0" w:line="276" w:lineRule="exact"/>
+        <w:spacing w:before="120" w:after="0" w:line="240" w:lineRule="exact"/>
         <w:ind w:left="504" w:right="1440" w:hanging="504"/>
         <w:jc w:val="left"/>
       </w:pPr>
@@ -3023,9 +3013,9 @@
       <w:pPr>
         <w:keepLines/>
         <w:tabs>
-          <w:tab w:val="right" w:leader="dot" w:pos="9360"/>
+          <w:tab w:val="right" w:leader="dot" w:pos="8640"/>
         </w:tabs>
-        <w:spacing w:before="120" w:after="0" w:line="276" w:lineRule="exact"/>
+        <w:spacing w:before="120" w:after="0" w:line="240" w:lineRule="exact"/>
         <w:ind w:left="504" w:right="1440" w:hanging="504"/>
         <w:jc w:val="left"/>
       </w:pPr>
@@ -3080,9 +3070,7 @@
         <w:t xml:space="preserve"> </w:t>
       </w:r>
       <w:r>
-        <w:t xml:space="preserve">08</w:t>
-        <w:noBreakHyphen/>
-        <w:t xml:space="preserve">5053</w:t>
+        <w:t xml:space="preserve">08-⁠5053</w:t>
       </w:r>
       <w:r>
         <w:t xml:space="preserve"> </w:t>
@@ -3152,9 +3140,9 @@
       <w:pPr>
         <w:keepLines/>
         <w:tabs>
-          <w:tab w:val="right" w:leader="dot" w:pos="9360"/>
+          <w:tab w:val="right" w:leader="dot" w:pos="8640"/>
         </w:tabs>
-        <w:spacing w:before="120" w:after="0" w:line="276" w:lineRule="exact"/>
+        <w:spacing w:before="120" w:after="0" w:line="240" w:lineRule="exact"/>
         <w:ind w:left="504" w:right="1440" w:hanging="504"/>
         <w:jc w:val="left"/>
       </w:pPr>
@@ -3271,9 +3259,9 @@
       <w:pPr>
         <w:keepLines/>
         <w:tabs>
-          <w:tab w:val="right" w:leader="dot" w:pos="9360"/>
+          <w:tab w:val="right" w:leader="dot" w:pos="8640"/>
         </w:tabs>
-        <w:spacing w:before="120" w:after="0" w:line="276" w:lineRule="exact"/>
+        <w:spacing w:before="120" w:after="0" w:line="240" w:lineRule="exact"/>
         <w:ind w:left="504" w:right="1440" w:hanging="504"/>
         <w:jc w:val="left"/>
       </w:pPr>
@@ -3418,9 +3406,9 @@
       <w:pPr>
         <w:keepLines/>
         <w:tabs>
-          <w:tab w:val="right" w:leader="dot" w:pos="9360"/>
+          <w:tab w:val="right" w:leader="dot" w:pos="8640"/>
         </w:tabs>
-        <w:spacing w:before="120" w:after="0" w:line="276" w:lineRule="exact"/>
+        <w:spacing w:before="120" w:after="0" w:line="240" w:lineRule="exact"/>
         <w:ind w:left="504" w:right="1440" w:hanging="504"/>
         <w:jc w:val="left"/>
       </w:pPr>
@@ -3509,9 +3497,9 @@
       <w:pPr>
         <w:keepLines/>
         <w:tabs>
-          <w:tab w:val="right" w:leader="dot" w:pos="9360"/>
+          <w:tab w:val="right" w:leader="dot" w:pos="8640"/>
         </w:tabs>
-        <w:spacing w:before="120" w:after="0" w:line="276" w:lineRule="exact"/>
+        <w:spacing w:before="120" w:after="0" w:line="240" w:lineRule="exact"/>
         <w:ind w:left="504" w:right="1440" w:hanging="504"/>
         <w:jc w:val="left"/>
       </w:pPr>
@@ -3642,9 +3630,9 @@
       <w:pPr>
         <w:keepLines/>
         <w:tabs>
-          <w:tab w:val="right" w:leader="dot" w:pos="9360"/>
+          <w:tab w:val="right" w:leader="dot" w:pos="8640"/>
         </w:tabs>
-        <w:spacing w:before="120" w:after="0" w:line="276" w:lineRule="exact"/>
+        <w:spacing w:before="120" w:after="0" w:line="240" w:lineRule="exact"/>
         <w:ind w:left="504" w:right="1440" w:hanging="504"/>
         <w:jc w:val="left"/>
       </w:pPr>
@@ -3733,9 +3721,9 @@
       <w:pPr>
         <w:keepLines/>
         <w:tabs>
-          <w:tab w:val="right" w:leader="dot" w:pos="9360"/>
+          <w:tab w:val="right" w:leader="dot" w:pos="8640"/>
         </w:tabs>
-        <w:spacing w:before="120" w:after="0" w:line="276" w:lineRule="exact"/>
+        <w:spacing w:before="120" w:after="0" w:line="240" w:lineRule="exact"/>
         <w:ind w:left="504" w:right="1440" w:hanging="504"/>
         <w:jc w:val="left"/>
       </w:pPr>
@@ -3798,11 +3786,7 @@
         <w:t xml:space="preserve"> </w:t>
       </w:r>
       <w:r>
-        <w:t xml:space="preserve">C</w:t>
-        <w:noBreakHyphen/>
-        <w:t xml:space="preserve">01</w:t>
-        <w:noBreakHyphen/>
-        <w:t xml:space="preserve">0024,</w:t>
+        <w:t xml:space="preserve">C-⁠01-⁠0024,</w:t>
       </w:r>
       <w:r>
         <w:t xml:space="preserve"> </w:t>
@@ -3866,7 +3850,7 @@
       <w:pPr>
         <w:keepNext/>
         <w:keepLines/>
-        <w:spacing w:before="240" w:after="0" w:line="276" w:lineRule="exact"/>
+        <w:spacing w:before="240" w:after="0" w:line="240" w:lineRule="exact"/>
         <w:ind w:left="0" w:firstLine="0"/>
         <w:jc w:val="left"/>
       </w:pPr>
@@ -3882,9 +3866,9 @@
       <w:pPr>
         <w:keepLines/>
         <w:tabs>
-          <w:tab w:val="right" w:leader="dot" w:pos="9360"/>
+          <w:tab w:val="right" w:leader="dot" w:pos="8640"/>
         </w:tabs>
-        <w:spacing w:before="120" w:after="0" w:line="276" w:lineRule="exact"/>
+        <w:spacing w:before="120" w:after="0" w:line="240" w:lineRule="exact"/>
         <w:ind w:left="504" w:right="1440" w:hanging="504"/>
         <w:jc w:val="left"/>
       </w:pPr>
@@ -3923,9 +3907,9 @@
       <w:pPr>
         <w:keepLines/>
         <w:tabs>
-          <w:tab w:val="right" w:leader="dot" w:pos="9360"/>
+          <w:tab w:val="right" w:leader="dot" w:pos="8640"/>
         </w:tabs>
-        <w:spacing w:before="120" w:after="0" w:line="276" w:lineRule="exact"/>
+        <w:spacing w:before="120" w:after="0" w:line="240" w:lineRule="exact"/>
         <w:ind w:left="504" w:right="1440" w:hanging="504"/>
         <w:jc w:val="left"/>
       </w:pPr>
@@ -3964,9 +3948,9 @@
       <w:pPr>
         <w:keepLines/>
         <w:tabs>
-          <w:tab w:val="right" w:leader="dot" w:pos="9360"/>
+          <w:tab w:val="right" w:leader="dot" w:pos="8640"/>
         </w:tabs>
-        <w:spacing w:before="120" w:after="0" w:line="276" w:lineRule="exact"/>
+        <w:spacing w:before="120" w:after="0" w:line="240" w:lineRule="exact"/>
         <w:ind w:left="504" w:right="1440" w:hanging="504"/>
         <w:jc w:val="left"/>
       </w:pPr>
@@ -4005,7 +3989,7 @@
       <w:pPr>
         <w:keepNext/>
         <w:keepLines/>
-        <w:spacing w:before="240" w:after="0" w:line="276" w:lineRule="exact"/>
+        <w:spacing w:before="240" w:after="0" w:line="240" w:lineRule="exact"/>
         <w:ind w:left="0" w:firstLine="0"/>
         <w:jc w:val="left"/>
       </w:pPr>
@@ -4021,9 +4005,9 @@
       <w:pPr>
         <w:keepLines/>
         <w:tabs>
-          <w:tab w:val="right" w:leader="dot" w:pos="9360"/>
+          <w:tab w:val="right" w:leader="dot" w:pos="8640"/>
         </w:tabs>
-        <w:spacing w:before="120" w:after="0" w:line="276" w:lineRule="exact"/>
+        <w:spacing w:before="120" w:after="0" w:line="240" w:lineRule="exact"/>
         <w:ind w:left="504" w:right="1440" w:hanging="504"/>
         <w:jc w:val="left"/>
       </w:pPr>
@@ -4068,9 +4052,9 @@
       <w:pPr>
         <w:keepLines/>
         <w:tabs>
-          <w:tab w:val="right" w:leader="dot" w:pos="9360"/>
+          <w:tab w:val="right" w:leader="dot" w:pos="8640"/>
         </w:tabs>
-        <w:spacing w:before="120" w:after="0" w:line="276" w:lineRule="exact"/>
+        <w:spacing w:before="120" w:after="0" w:line="240" w:lineRule="exact"/>
         <w:ind w:left="504" w:right="1440" w:hanging="504"/>
         <w:jc w:val="left"/>
       </w:pPr>
@@ -4115,9 +4099,9 @@
       <w:pPr>
         <w:keepLines/>
         <w:tabs>
-          <w:tab w:val="right" w:leader="dot" w:pos="9360"/>
+          <w:tab w:val="right" w:leader="dot" w:pos="8640"/>
         </w:tabs>
-        <w:spacing w:before="120" w:after="0" w:line="276" w:lineRule="exact"/>
+        <w:spacing w:before="120" w:after="0" w:line="240" w:lineRule="exact"/>
         <w:ind w:left="504" w:right="1440" w:hanging="504"/>
         <w:jc w:val="left"/>
       </w:pPr>
@@ -4162,7 +4146,7 @@
       <w:pPr>
         <w:keepNext/>
         <w:keepLines/>
-        <w:spacing w:before="240" w:after="0" w:line="276" w:lineRule="exact"/>
+        <w:spacing w:before="240" w:after="0" w:line="240" w:lineRule="exact"/>
         <w:ind w:left="0" w:firstLine="0"/>
         <w:jc w:val="left"/>
       </w:pPr>
@@ -4178,9 +4162,9 @@
       <w:pPr>
         <w:keepLines/>
         <w:tabs>
-          <w:tab w:val="right" w:leader="dot" w:pos="9360"/>
+          <w:tab w:val="right" w:leader="dot" w:pos="8640"/>
         </w:tabs>
-        <w:spacing w:before="120" w:after="0" w:line="276" w:lineRule="exact"/>
+        <w:spacing w:before="120" w:after="0" w:line="240" w:lineRule="exact"/>
         <w:ind w:left="504" w:right="1440" w:hanging="504"/>
         <w:jc w:val="left"/>
       </w:pPr>
@@ -4219,9 +4203,9 @@
       <w:pPr>
         <w:keepLines/>
         <w:tabs>
-          <w:tab w:val="right" w:leader="dot" w:pos="9360"/>
+          <w:tab w:val="right" w:leader="dot" w:pos="8640"/>
         </w:tabs>
-        <w:spacing w:before="120" w:after="0" w:line="276" w:lineRule="exact"/>
+        <w:spacing w:before="120" w:after="0" w:line="240" w:lineRule="exact"/>
         <w:ind w:left="504" w:right="1440" w:hanging="504"/>
         <w:jc w:val="left"/>
       </w:pPr>
@@ -4260,7 +4244,7 @@
       <w:pPr>
         <w:keepNext/>
         <w:keepLines/>
-        <w:spacing w:before="240" w:after="0" w:line="276" w:lineRule="exact"/>
+        <w:spacing w:before="240" w:after="0" w:line="240" w:lineRule="exact"/>
         <w:ind w:left="0" w:firstLine="0"/>
         <w:jc w:val="left"/>
       </w:pPr>
@@ -4276,9 +4260,9 @@
       <w:pPr>
         <w:keepLines/>
         <w:tabs>
-          <w:tab w:val="right" w:leader="dot" w:pos="9360"/>
+          <w:tab w:val="right" w:leader="dot" w:pos="8640"/>
         </w:tabs>
-        <w:spacing w:before="120" w:after="0" w:line="276" w:lineRule="exact"/>
+        <w:spacing w:before="120" w:after="0" w:line="240" w:lineRule="exact"/>
         <w:ind w:left="504" w:right="1440" w:hanging="504"/>
         <w:jc w:val="left"/>
       </w:pPr>
@@ -4337,7 +4321,7 @@
         <w:sectPr>
           <w:footerReference w:type="default" r:id="rIdCandFooter"/>
           <w:pgSz w:w="12240" w:h="15840"/>
-          <w:pgMar w:top="1440" w:right="1440" w:bottom="1440" w:left="1440" w:header="720" w:footer="360" w:gutter="0"/>
+          <w:pgMar w:top="1200" w:right="1440" w:bottom="1200" w:left="2160" w:header="720" w:footer="160" w:gutter="0"/>
           <w:pgNumType w:fmt="lowerRoman" w:start="1"/>
         </w:sectPr>
       </w:pPr>
@@ -4347,7 +4331,7 @@
         <w:pStyle w:val="Heading1"/>
         <w:keepNext/>
         <w:keepLines/>
-        <w:spacing w:before="0" w:after="240" w:line="276" w:lineRule="exact"/>
+        <w:spacing w:before="0" w:after="240" w:line="240" w:lineRule="exact"/>
         <w:ind w:left="0" w:firstLine="0"/>
         <w:jc w:val="center"/>
       </w:pPr>
@@ -4412,7 +4396,7 @@
         <w:pStyle w:val="Heading1"/>
         <w:keepNext/>
         <w:keepLines/>
-        <w:spacing w:before="240" w:after="240" w:line="276" w:lineRule="exact"/>
+        <w:spacing w:before="240" w:after="240" w:line="240" w:lineRule="exact"/>
         <w:ind w:left="0" w:firstLine="0"/>
         <w:jc w:val="center"/>
       </w:pPr>
@@ -4451,7 +4435,7 @@
         <w:pStyle w:val="Heading1"/>
         <w:keepNext/>
         <w:keepLines/>
-        <w:spacing w:before="240" w:after="240" w:line="276" w:lineRule="exact"/>
+        <w:spacing w:before="240" w:after="240" w:line="240" w:lineRule="exact"/>
         <w:ind w:left="0" w:firstLine="0"/>
         <w:jc w:val="center"/>
       </w:pPr>
@@ -4534,7 +4518,7 @@
         <w:pStyle w:val="Heading1"/>
         <w:keepNext/>
         <w:keepLines/>
-        <w:spacing w:before="240" w:after="240" w:line="276" w:lineRule="exact"/>
+        <w:spacing w:before="240" w:after="240" w:line="240" w:lineRule="exact"/>
         <w:ind w:left="0" w:firstLine="0"/>
         <w:jc w:val="center"/>
       </w:pPr>
@@ -4610,7 +4594,7 @@
         <w:tabs>
           <w:tab w:val="left" w:pos="720"/>
         </w:tabs>
-        <w:spacing w:before="240" w:after="240" w:line="276" w:lineRule="exact"/>
+        <w:spacing w:before="240" w:after="240" w:line="240" w:lineRule="exact"/>
         <w:ind w:left="720" w:hanging="720"/>
         <w:jc w:val="left"/>
       </w:pPr>
@@ -4676,7 +4660,7 @@
         <w:tabs>
           <w:tab w:val="left" w:pos="720"/>
         </w:tabs>
-        <w:spacing w:before="240" w:after="240" w:line="276" w:lineRule="exact"/>
+        <w:spacing w:before="240" w:after="240" w:line="240" w:lineRule="exact"/>
         <w:ind w:left="720" w:hanging="720"/>
         <w:jc w:val="left"/>
       </w:pPr>
@@ -4859,13 +4843,7 @@
         <w:t xml:space="preserve"> </w:t>
       </w:r>
       <w:r>
-        <w:t xml:space="preserve">¶¶ 26</w:t>
-      </w:r>
-      <w:r>
-        <w:noBreakHyphen/>
-      </w:r>
-      <w:r>
-        <w:t xml:space="preserve">30, unlawfully interpreted the California Rancheria Act,</w:t>
+        <w:t xml:space="preserve">¶¶ 26-⁠30, unlawfully interpreted the California Rancheria Act,</w:t>
       </w:r>
       <w:r>
         <w:t xml:space="preserve"> </w:t>
@@ -4881,13 +4859,7 @@
         <w:t xml:space="preserve"> </w:t>
       </w:r>
       <w:r>
-        <w:t xml:space="preserve">¶¶ 31</w:t>
-      </w:r>
-      <w:r>
-        <w:noBreakHyphen/>
-      </w:r>
-      <w:r>
-        <w:t xml:space="preserve">36, and unlawfully denied the status of Plaintiff as a federally recognized tribe because of the alleged misinterpretation of the California Rancheria Act,</w:t>
+        <w:t xml:space="preserve">¶¶ 31-⁠36, and unlawfully denied the status of Plaintiff as a federally recognized tribe because of the alleged misinterpretation of the California Rancheria Act,</w:t>
       </w:r>
       <w:r>
         <w:t xml:space="preserve"> </w:t>
@@ -4903,13 +4875,7 @@
         <w:t xml:space="preserve"> </w:t>
       </w:r>
       <w:r>
-        <w:t xml:space="preserve">¶¶ 35</w:t>
-      </w:r>
-      <w:r>
-        <w:noBreakHyphen/>
-      </w:r>
-      <w:r>
-        <w:t xml:space="preserve">37.</w:t>
+        <w:t xml:space="preserve">¶¶ 35-⁠37.</w:t>
       </w:r>
     </w:p>
     <w:p>
@@ -4920,7 +4886,7 @@
         <w:tabs>
           <w:tab w:val="left" w:pos="720"/>
         </w:tabs>
-        <w:spacing w:before="240" w:after="240" w:line="276" w:lineRule="exact"/>
+        <w:spacing w:before="240" w:after="240" w:line="240" w:lineRule="exact"/>
         <w:ind w:left="720" w:hanging="720"/>
         <w:jc w:val="left"/>
       </w:pPr>
@@ -4946,7 +4912,7 @@
         <w:tabs>
           <w:tab w:val="left" w:pos="1440"/>
         </w:tabs>
-        <w:spacing w:before="240" w:after="240" w:line="276" w:lineRule="exact"/>
+        <w:spacing w:before="240" w:after="240" w:line="240" w:lineRule="exact"/>
         <w:ind w:left="1440" w:hanging="720"/>
         <w:jc w:val="left"/>
       </w:pPr>
@@ -5196,7 +5162,7 @@
         <w:tabs>
           <w:tab w:val="left" w:pos="2160"/>
         </w:tabs>
-        <w:spacing w:before="240" w:after="240" w:line="276" w:lineRule="exact"/>
+        <w:spacing w:before="240" w:after="240" w:line="240" w:lineRule="exact"/>
         <w:ind w:left="2160" w:hanging="720"/>
         <w:jc w:val="left"/>
       </w:pPr>
@@ -5246,13 +5212,7 @@
         <w:t xml:space="preserve">Munson v. California</w:t>
       </w:r>
       <w:r>
-        <w:t xml:space="preserve">, No. C 08</w:t>
-      </w:r>
-      <w:r>
-        <w:noBreakHyphen/>
-      </w:r>
-      <w:r>
-        <w:t xml:space="preserve">5053 SBA, 2009 WL 264838, at *1 (N.D. Cal. Feb. 4, 2009) (citation omitted). On a Rule 12(b)⁠(3) motion, “the pleadings need not be accepted as true, and the court may consider facts outside of the pleadings,” but the court must draw all reasonable inferences and resolve all factual conflicts in favor of the non-moving party.</w:t>
+        <w:t xml:space="preserve">, No. C 08-⁠5053 SBA, 2009 WL 264838, at *1 (N.D. Cal. Feb. 4, 2009) (citation omitted). On a Rule 12(b)⁠(3) motion, “the pleadings need not be accepted as true, and the court may consider facts outside of the pleadings,” but the court must draw all reasonable inferences and resolve all factual conflicts in favor of the non-moving party.</w:t>
       </w:r>
       <w:r>
         <w:t xml:space="preserve"> </w:t>
@@ -5278,19 +5238,7 @@
         <w:t xml:space="preserve">Animal Legal Def. Fund v. U.S. Dep’t of Agric.</w:t>
       </w:r>
       <w:r>
-        <w:t xml:space="preserve">, No. CV 12</w:t>
-      </w:r>
-      <w:r>
-        <w:noBreakHyphen/>
-      </w:r>
-      <w:r>
-        <w:t xml:space="preserve">4407-SC, 2013 WL 120185, at *1</w:t>
-      </w:r>
-      <w:r>
-        <w:noBreakHyphen/>
-      </w:r>
-      <w:r>
-        <w:t xml:space="preserve">2 (N.D. Cal. Jan. 8, 2013).</w:t>
+        <w:t xml:space="preserve">, No. CV 12-⁠4407-SC, 2013 WL 120185, at *1-⁠2 (N.D. Cal. Jan. 8, 2013).</w:t>
       </w:r>
     </w:p>
     <w:p>
@@ -5301,7 +5249,7 @@
         <w:tabs>
           <w:tab w:val="left" w:pos="2160"/>
         </w:tabs>
-        <w:spacing w:before="240" w:after="240" w:line="276" w:lineRule="exact"/>
+        <w:spacing w:before="240" w:after="240" w:line="240" w:lineRule="exact"/>
         <w:ind w:left="2160" w:hanging="720"/>
         <w:jc w:val="left"/>
       </w:pPr>
@@ -5515,19 +5463,7 @@
         <w:t xml:space="preserve">Williams v. United States</w:t>
       </w:r>
       <w:r>
-        <w:t xml:space="preserve">, No. C</w:t>
-      </w:r>
-      <w:r>
-        <w:noBreakHyphen/>
-      </w:r>
-      <w:r>
-        <w:t xml:space="preserve">01</w:t>
-      </w:r>
-      <w:r>
-        <w:noBreakHyphen/>
-      </w:r>
-      <w:r>
-        <w:t xml:space="preserve">0024, 2001 WL 1352885, at *1 (N.D. Cal. Oct. 23, 2001). As to § 1391(e)⁠(1)⁠(C), Plaintiff has identified on the Civil Cover Sheet its county of residence as Plumas County in the Eastern District of California.</w:t>
+        <w:t xml:space="preserve">, No. C-⁠01-⁠0024, 2001 WL 1352885, at *1 (N.D. Cal. Oct. 23, 2001). As to § 1391(e)⁠(1)⁠(C), Plaintiff has identified on the Civil Cover Sheet its county of residence as Plumas County in the Eastern District of California.</w:t>
       </w:r>
       <w:r>
         <w:t xml:space="preserve"> </w:t>
@@ -5554,7 +5490,7 @@
         <w:tabs>
           <w:tab w:val="left" w:pos="2160"/>
         </w:tabs>
-        <w:spacing w:before="240" w:after="240" w:line="276" w:lineRule="exact"/>
+        <w:spacing w:before="240" w:after="240" w:line="240" w:lineRule="exact"/>
         <w:ind w:left="2160" w:hanging="720"/>
         <w:jc w:val="left"/>
       </w:pPr>
@@ -5713,7 +5649,7 @@
         <w:tabs>
           <w:tab w:val="left" w:pos="1440"/>
         </w:tabs>
-        <w:spacing w:before="240" w:after="240" w:line="276" w:lineRule="exact"/>
+        <w:spacing w:before="240" w:after="240" w:line="240" w:lineRule="exact"/>
         <w:ind w:left="1440" w:hanging="720"/>
         <w:jc w:val="left"/>
       </w:pPr>
@@ -5907,7 +5843,7 @@
         <w:tabs>
           <w:tab w:val="left" w:pos="2160"/>
         </w:tabs>
-        <w:spacing w:before="240" w:after="240" w:line="276" w:lineRule="exact"/>
+        <w:spacing w:before="240" w:after="240" w:line="240" w:lineRule="exact"/>
         <w:ind w:left="2160" w:hanging="720"/>
         <w:jc w:val="left"/>
       </w:pPr>
@@ -6124,7 +6060,7 @@
         <w:pStyle w:val="Heading1"/>
         <w:keepNext/>
         <w:keepLines/>
-        <w:spacing w:before="240" w:after="240" w:line="276" w:lineRule="exact"/>
+        <w:spacing w:before="240" w:after="240" w:line="240" w:lineRule="exact"/>
         <w:ind w:left="0" w:firstLine="0"/>
         <w:jc w:val="center"/>
       </w:pPr>
@@ -6155,7 +6091,7 @@
     </w:p>
     <w:tbl>
       <w:tblPr>
-        <w:tblW w:w="9360" w:type="dxa"/>
+        <w:tblW w:w="8640" w:type="dxa"/>
         <w:tblLayout w:type="fixed"/>
         <w:tblCellMar>
           <w:top w:w="0" w:type="dxa"/>
@@ -6166,7 +6102,7 @@
         <w:tblLook w:val="0000" w:firstRow="0" w:lastRow="0" w:firstColumn="0" w:lastColumn="0" w:noHBand="0" w:noVBand="0"/>
       </w:tblPr>
       <w:tblGrid>
-        <w:gridCol w:w="4752"/>
+        <w:gridCol w:w="4032"/>
         <w:gridCol w:w="4608"/>
       </w:tblGrid>
       <w:tr>
@@ -6175,11 +6111,11 @@
         </w:trPr>
         <w:tc>
           <w:tcPr>
-            <w:tcW w:w="4752" w:type="dxa"/>
+            <w:tcW w:w="4032" w:type="dxa"/>
           </w:tcPr>
           <w:p>
             <w:pPr>
-              <w:spacing w:before="0" w:after="0" w:line="276" w:lineRule="exact"/>
+              <w:spacing w:before="0" w:after="0" w:line="240" w:lineRule="exact"/>
               <w:ind w:left="0" w:firstLine="0"/>
               <w:jc w:val="left"/>
             </w:pPr>
@@ -6209,7 +6145,7 @@
           </w:tcPr>
           <w:p>
             <w:pPr>
-              <w:spacing w:before="0" w:after="0" w:line="276" w:lineRule="exact"/>
+              <w:spacing w:before="0" w:after="0" w:line="240" w:lineRule="exact"/>
               <w:ind w:left="0" w:firstLine="0"/>
               <w:jc w:val="left"/>
             </w:pPr>
@@ -6219,7 +6155,7 @@
           </w:p>
           <w:p>
             <w:pPr>
-              <w:spacing w:before="480" w:after="0" w:line="276" w:lineRule="exact"/>
+              <w:spacing w:before="480" w:after="0" w:line="240" w:lineRule="exact"/>
               <w:ind w:left="0" w:firstLine="0"/>
               <w:jc w:val="left"/>
             </w:pPr>
@@ -6241,7 +6177,7 @@
           </w:p>
           <w:p>
             <w:pPr>
-              <w:spacing w:before="0" w:after="0" w:line="276" w:lineRule="exact"/>
+              <w:spacing w:before="0" w:after="0" w:line="240" w:lineRule="exact"/>
               <w:ind w:left="0" w:firstLine="0"/>
               <w:jc w:val="left"/>
             </w:pPr>
@@ -6263,17 +6199,21 @@
           </w:p>
           <w:p>
             <w:pPr>
-              <w:spacing w:before="480" w:after="0" w:line="276" w:lineRule="exact"/>
+              <w:spacing w:before="480" w:after="0" w:line="240" w:lineRule="exact"/>
               <w:ind w:left="0" w:firstLine="0"/>
               <w:jc w:val="left"/>
             </w:pPr>
             <w:r>
+              <w:rPr>
+                <w:i/>
+                <w:iCs/>
+              </w:rPr>
               <w:t xml:space="preserve">/s/ Michelle Lo</w:t>
             </w:r>
           </w:p>
           <w:p>
             <w:pPr>
-              <w:spacing w:before="0" w:after="0" w:line="276" w:lineRule="exact"/>
+              <w:spacing w:before="0" w:after="0" w:line="240" w:lineRule="exact"/>
               <w:ind w:left="0" w:firstLine="0"/>
               <w:jc w:val="left"/>
             </w:pPr>
@@ -6289,7 +6229,7 @@
           </w:p>
           <w:p>
             <w:pPr>
-              <w:spacing w:before="0" w:after="0" w:line="276" w:lineRule="exact"/>
+              <w:spacing w:before="0" w:after="0" w:line="240" w:lineRule="exact"/>
               <w:ind w:left="0" w:firstLine="0"/>
               <w:jc w:val="left"/>
             </w:pPr>
@@ -6317,7 +6257,7 @@
           </w:p>
           <w:p>
             <w:pPr>
-              <w:spacing w:before="0" w:after="0" w:line="276" w:lineRule="exact"/>
+              <w:spacing w:before="0" w:after="0" w:line="240" w:lineRule="exact"/>
               <w:ind w:left="0" w:firstLine="0"/>
               <w:jc w:val="left"/>
             </w:pPr>
@@ -6343,7 +6283,7 @@
     <w:sectPr>
       <w:footerReference w:type="default" r:id="rIdCandFooter"/>
       <w:pgSz w:w="12240" w:h="15840"/>
-      <w:pgMar w:top="1440" w:right="1440" w:bottom="1440" w:left="1440" w:header="720" w:footer="360" w:gutter="0"/>
+      <w:pgMar w:top="1200" w:right="1440" w:bottom="1200" w:left="2160" w:header="720" w:footer="160" w:gutter="0"/>
       <w:pgNumType w:fmt="decimal" w:start="1"/>
     </w:sectPr>
   </w:body>
@@ -6490,354 +6430,977 @@
 <w:ftr xmlns:w="http://schemas.openxmlformats.org/wordprocessingml/2006/main" xmlns:r="http://schemas.openxmlformats.org/officeDocument/2006/relationships">
   <w:p>
     <w:pPr>
-      <w:spacing w:before="0" w:after="0" w:line="253" w:lineRule="exact"/>
+      <w:spacing w:before="0" w:after="0" w:line="20" w:lineRule="exact"/>
+    </w:pPr>
+    <w:r>
+      <w:pict xmlns:v="urn:schemas-microsoft-com:vml" xmlns:o="urn:schemas-microsoft-com:office:office">
+        <v:shape id="CandLineNumbers" filled="f" stroked="f" style="position:absolute;mso-position-horizontal:absolute;mso-position-horizontal-relative:page;mso-position-vertical:absolute;mso-position-vertical-relative:page;margin-left:4pt;margin-top:55.75pt;width:72.0pt;height:684.0pt;z-index:-251658752">
+          <v:textbox inset="0pt,0pt,0pt,0pt">
+            <w:txbxContent>
+              <w:p>
+                <w:pPr>
+                  <w:spacing w:before="0" w:after="0" w:line="480" w:lineRule="exact"/>
+                  <w:ind w:left="0" w:firstLine="0"/>
+                  <w:jc w:val="right"/>
+                </w:pPr>
+                <w:r>
+                  <w:t xml:space="preserve">1</w:t>
+                </w:r>
+              </w:p>
+              <w:p>
+                <w:pPr>
+                  <w:spacing w:before="0" w:after="0" w:line="480" w:lineRule="exact"/>
+                  <w:ind w:left="0" w:firstLine="0"/>
+                  <w:jc w:val="right"/>
+                </w:pPr>
+                <w:r>
+                  <w:t xml:space="preserve">2</w:t>
+                </w:r>
+              </w:p>
+              <w:p>
+                <w:pPr>
+                  <w:spacing w:before="0" w:after="0" w:line="480" w:lineRule="exact"/>
+                  <w:ind w:left="0" w:firstLine="0"/>
+                  <w:jc w:val="right"/>
+                </w:pPr>
+                <w:r>
+                  <w:t xml:space="preserve">3</w:t>
+                </w:r>
+              </w:p>
+              <w:p>
+                <w:pPr>
+                  <w:spacing w:before="0" w:after="0" w:line="480" w:lineRule="exact"/>
+                  <w:ind w:left="0" w:firstLine="0"/>
+                  <w:jc w:val="right"/>
+                </w:pPr>
+                <w:r>
+                  <w:t xml:space="preserve">4</w:t>
+                </w:r>
+              </w:p>
+              <w:p>
+                <w:pPr>
+                  <w:spacing w:before="0" w:after="0" w:line="480" w:lineRule="exact"/>
+                  <w:ind w:left="0" w:firstLine="0"/>
+                  <w:jc w:val="right"/>
+                </w:pPr>
+                <w:r>
+                  <w:t xml:space="preserve">5</w:t>
+                </w:r>
+              </w:p>
+              <w:p>
+                <w:pPr>
+                  <w:spacing w:before="0" w:after="0" w:line="480" w:lineRule="exact"/>
+                  <w:ind w:left="0" w:firstLine="0"/>
+                  <w:jc w:val="right"/>
+                </w:pPr>
+                <w:r>
+                  <w:t xml:space="preserve">6</w:t>
+                </w:r>
+              </w:p>
+              <w:p>
+                <w:pPr>
+                  <w:spacing w:before="0" w:after="0" w:line="480" w:lineRule="exact"/>
+                  <w:ind w:left="0" w:firstLine="0"/>
+                  <w:jc w:val="right"/>
+                </w:pPr>
+                <w:r>
+                  <w:t xml:space="preserve">7</w:t>
+                </w:r>
+              </w:p>
+              <w:p>
+                <w:pPr>
+                  <w:spacing w:before="0" w:after="0" w:line="480" w:lineRule="exact"/>
+                  <w:ind w:left="0" w:firstLine="0"/>
+                  <w:jc w:val="right"/>
+                </w:pPr>
+                <w:r>
+                  <w:t xml:space="preserve">8</w:t>
+                </w:r>
+              </w:p>
+              <w:p>
+                <w:pPr>
+                  <w:spacing w:before="0" w:after="0" w:line="480" w:lineRule="exact"/>
+                  <w:ind w:left="0" w:firstLine="0"/>
+                  <w:jc w:val="right"/>
+                </w:pPr>
+                <w:r>
+                  <w:t xml:space="preserve">9</w:t>
+                </w:r>
+              </w:p>
+              <w:p>
+                <w:pPr>
+                  <w:spacing w:before="0" w:after="0" w:line="480" w:lineRule="exact"/>
+                  <w:ind w:left="0" w:firstLine="0"/>
+                  <w:jc w:val="right"/>
+                </w:pPr>
+                <w:r>
+                  <w:t xml:space="preserve">10</w:t>
+                </w:r>
+              </w:p>
+              <w:p>
+                <w:pPr>
+                  <w:spacing w:before="0" w:after="0" w:line="480" w:lineRule="exact"/>
+                  <w:ind w:left="0" w:firstLine="0"/>
+                  <w:jc w:val="right"/>
+                </w:pPr>
+                <w:r>
+                  <w:t xml:space="preserve">11</w:t>
+                </w:r>
+              </w:p>
+              <w:p>
+                <w:pPr>
+                  <w:spacing w:before="0" w:after="0" w:line="480" w:lineRule="exact"/>
+                  <w:ind w:left="0" w:firstLine="0"/>
+                  <w:jc w:val="right"/>
+                </w:pPr>
+                <w:r>
+                  <w:t xml:space="preserve">12</w:t>
+                </w:r>
+              </w:p>
+              <w:p>
+                <w:pPr>
+                  <w:spacing w:before="0" w:after="0" w:line="480" w:lineRule="exact"/>
+                  <w:ind w:left="0" w:firstLine="0"/>
+                  <w:jc w:val="right"/>
+                </w:pPr>
+                <w:r>
+                  <w:t xml:space="preserve">13</w:t>
+                </w:r>
+              </w:p>
+              <w:p>
+                <w:pPr>
+                  <w:spacing w:before="0" w:after="0" w:line="480" w:lineRule="exact"/>
+                  <w:ind w:left="0" w:firstLine="0"/>
+                  <w:jc w:val="right"/>
+                </w:pPr>
+                <w:r>
+                  <w:t xml:space="preserve">14</w:t>
+                </w:r>
+              </w:p>
+              <w:p>
+                <w:pPr>
+                  <w:spacing w:before="0" w:after="0" w:line="480" w:lineRule="exact"/>
+                  <w:ind w:left="0" w:firstLine="0"/>
+                  <w:jc w:val="right"/>
+                </w:pPr>
+                <w:r>
+                  <w:t xml:space="preserve">15</w:t>
+                </w:r>
+              </w:p>
+              <w:p>
+                <w:pPr>
+                  <w:spacing w:before="0" w:after="0" w:line="480" w:lineRule="exact"/>
+                  <w:ind w:left="0" w:firstLine="0"/>
+                  <w:jc w:val="right"/>
+                </w:pPr>
+                <w:r>
+                  <w:t xml:space="preserve">16</w:t>
+                </w:r>
+              </w:p>
+              <w:p>
+                <w:pPr>
+                  <w:spacing w:before="0" w:after="0" w:line="480" w:lineRule="exact"/>
+                  <w:ind w:left="0" w:firstLine="0"/>
+                  <w:jc w:val="right"/>
+                </w:pPr>
+                <w:r>
+                  <w:t xml:space="preserve">17</w:t>
+                </w:r>
+              </w:p>
+              <w:p>
+                <w:pPr>
+                  <w:spacing w:before="0" w:after="0" w:line="480" w:lineRule="exact"/>
+                  <w:ind w:left="0" w:firstLine="0"/>
+                  <w:jc w:val="right"/>
+                </w:pPr>
+                <w:r>
+                  <w:t xml:space="preserve">18</w:t>
+                </w:r>
+              </w:p>
+              <w:p>
+                <w:pPr>
+                  <w:spacing w:before="0" w:after="0" w:line="480" w:lineRule="exact"/>
+                  <w:ind w:left="0" w:firstLine="0"/>
+                  <w:jc w:val="right"/>
+                </w:pPr>
+                <w:r>
+                  <w:t xml:space="preserve">19</w:t>
+                </w:r>
+              </w:p>
+              <w:p>
+                <w:pPr>
+                  <w:spacing w:before="0" w:after="0" w:line="480" w:lineRule="exact"/>
+                  <w:ind w:left="0" w:firstLine="0"/>
+                  <w:jc w:val="right"/>
+                </w:pPr>
+                <w:r>
+                  <w:t xml:space="preserve">20</w:t>
+                </w:r>
+              </w:p>
+              <w:p>
+                <w:pPr>
+                  <w:spacing w:before="0" w:after="0" w:line="480" w:lineRule="exact"/>
+                  <w:ind w:left="0" w:firstLine="0"/>
+                  <w:jc w:val="right"/>
+                </w:pPr>
+                <w:r>
+                  <w:t xml:space="preserve">21</w:t>
+                </w:r>
+              </w:p>
+              <w:p>
+                <w:pPr>
+                  <w:spacing w:before="0" w:after="0" w:line="480" w:lineRule="exact"/>
+                  <w:ind w:left="0" w:firstLine="0"/>
+                  <w:jc w:val="right"/>
+                </w:pPr>
+                <w:r>
+                  <w:t xml:space="preserve">22</w:t>
+                </w:r>
+              </w:p>
+              <w:p>
+                <w:pPr>
+                  <w:spacing w:before="0" w:after="0" w:line="480" w:lineRule="exact"/>
+                  <w:ind w:left="0" w:firstLine="0"/>
+                  <w:jc w:val="right"/>
+                </w:pPr>
+                <w:r>
+                  <w:t xml:space="preserve">23</w:t>
+                </w:r>
+              </w:p>
+              <w:p>
+                <w:pPr>
+                  <w:spacing w:before="0" w:after="0" w:line="480" w:lineRule="exact"/>
+                  <w:ind w:left="0" w:firstLine="0"/>
+                  <w:jc w:val="right"/>
+                </w:pPr>
+                <w:r>
+                  <w:t xml:space="preserve">24</w:t>
+                </w:r>
+              </w:p>
+              <w:p>
+                <w:pPr>
+                  <w:spacing w:before="0" w:after="0" w:line="480" w:lineRule="exact"/>
+                  <w:ind w:left="0" w:firstLine="0"/>
+                  <w:jc w:val="right"/>
+                </w:pPr>
+                <w:r>
+                  <w:t xml:space="preserve">25</w:t>
+                </w:r>
+              </w:p>
+              <w:p>
+                <w:pPr>
+                  <w:spacing w:before="0" w:after="0" w:line="480" w:lineRule="exact"/>
+                  <w:ind w:left="0" w:firstLine="0"/>
+                  <w:jc w:val="right"/>
+                </w:pPr>
+                <w:r>
+                  <w:t xml:space="preserve">26</w:t>
+                </w:r>
+              </w:p>
+              <w:p>
+                <w:pPr>
+                  <w:spacing w:before="0" w:after="0" w:line="480" w:lineRule="exact"/>
+                  <w:ind w:left="0" w:firstLine="0"/>
+                  <w:jc w:val="right"/>
+                </w:pPr>
+                <w:r>
+                  <w:t xml:space="preserve">27</w:t>
+                </w:r>
+              </w:p>
+              <w:p>
+                <w:pPr>
+                  <w:spacing w:before="0" w:after="0" w:line="480" w:lineRule="exact"/>
+                  <w:ind w:left="0" w:firstLine="0"/>
+                  <w:jc w:val="right"/>
+                </w:pPr>
+                <w:r>
+                  <w:t xml:space="preserve">28</w:t>
+                </w:r>
+              </w:p>
+            </w:txbxContent>
+          </v:textbox>
+        </v:shape>
+      </w:pict>
+    </w:r>
+    <w:r>
+      <w:pict xmlns:v="urn:schemas-microsoft-com:vml" xmlns:o="urn:schemas-microsoft-com:office:office">
+        <v:rect id="CandRule1" fillcolor="black" filled="t" stroked="f" style="position:absolute;mso-position-horizontal:absolute;mso-position-horizontal-relative:page;mso-position-vertical:absolute;mso-position-vertical-relative:page;margin-left:93.23pt;margin-top:0;width:0.75pt;height:792pt;z-index:-251658701"/>
+      </w:pict>
+    </w:r>
+    <w:r>
+      <w:pict xmlns:v="urn:schemas-microsoft-com:vml" xmlns:o="urn:schemas-microsoft-com:office:office">
+        <v:rect id="CandRule2" fillcolor="black" filled="t" stroked="f" style="position:absolute;mso-position-horizontal:absolute;mso-position-horizontal-relative:page;mso-position-vertical:absolute;mso-position-vertical-relative:page;margin-left:96.11pt;margin-top:0;width:0.75pt;height:792pt;z-index:-251658702"/>
+      </w:pict>
+    </w:r>
+    <w:r>
+      <w:pict xmlns:v="urn:schemas-microsoft-com:vml" xmlns:o="urn:schemas-microsoft-com:office:office">
+        <v:rect id="CandRule3" fillcolor="black" filled="t" stroked="f" style="position:absolute;mso-position-horizontal:absolute;mso-position-horizontal-relative:page;mso-position-vertical:absolute;mso-position-vertical-relative:page;margin-left:546.82pt;margin-top:0;width:0.75pt;height:792pt;z-index:-251658703"/>
+      </w:pict>
+    </w:r>
+  </w:p>
+  <w:p>
+    <w:pPr>
+      <w:spacing w:before="0" w:after="0" w:line="230" w:lineRule="exact"/>
       <w:ind w:left="0" w:firstLine="0"/>
       <w:jc w:val="center"/>
     </w:pPr>
     <w:r>
       <w:rPr>
-        <w:sz w:val="22"/>
-        <w:szCs w:val="22"/>
+        <w:sz w:val="20"/>
+        <w:szCs w:val="20"/>
       </w:rPr>
       <w:fldChar w:fldCharType="begin"/>
     </w:r>
     <w:r>
       <w:rPr>
-        <w:sz w:val="22"/>
-        <w:szCs w:val="22"/>
+        <w:sz w:val="20"/>
+        <w:szCs w:val="20"/>
       </w:rPr>
       <w:instrText xml:space="preserve"> PAGE </w:instrText>
     </w:r>
     <w:r>
       <w:rPr>
-        <w:sz w:val="22"/>
-        <w:szCs w:val="22"/>
+        <w:sz w:val="20"/>
+        <w:szCs w:val="20"/>
       </w:rPr>
       <w:fldChar w:fldCharType="separate"/>
     </w:r>
     <w:r>
       <w:rPr>
-        <w:sz w:val="22"/>
-        <w:szCs w:val="22"/>
+        <w:sz w:val="20"/>
+        <w:szCs w:val="20"/>
       </w:rPr>
       <w:t>1</w:t>
     </w:r>
     <w:r>
       <w:rPr>
-        <w:sz w:val="22"/>
-        <w:szCs w:val="22"/>
+        <w:sz w:val="20"/>
+        <w:szCs w:val="20"/>
       </w:rPr>
       <w:fldChar w:fldCharType="end"/>
     </w:r>
   </w:p>
   <w:p>
     <w:pPr>
-      <w:spacing w:before="0" w:after="0" w:line="253" w:lineRule="exact"/>
+      <w:spacing w:before="0" w:after="0" w:line="230" w:lineRule="exact"/>
       <w:ind w:left="0" w:firstLine="0"/>
       <w:jc w:val="center"/>
     </w:pPr>
     <w:r>
       <w:rPr>
-        <w:sz w:val="22"/>
-        <w:szCs w:val="22"/>
+        <w:sz w:val="20"/>
+        <w:szCs w:val="20"/>
       </w:rPr>
       <w:t xml:space="preserve">MOTION</w:t>
     </w:r>
     <w:r>
       <w:rPr>
-        <w:sz w:val="22"/>
-        <w:szCs w:val="22"/>
+        <w:sz w:val="20"/>
+        <w:szCs w:val="20"/>
       </w:rPr>
       <w:t xml:space="preserve"> </w:t>
     </w:r>
     <w:r>
       <w:rPr>
-        <w:sz w:val="22"/>
-        <w:szCs w:val="22"/>
+        <w:sz w:val="20"/>
+        <w:szCs w:val="20"/>
       </w:rPr>
       <w:t xml:space="preserve">TO</w:t>
     </w:r>
     <w:r>
       <w:rPr>
-        <w:sz w:val="22"/>
-        <w:szCs w:val="22"/>
+        <w:sz w:val="20"/>
+        <w:szCs w:val="20"/>
       </w:rPr>
       <w:t xml:space="preserve"> </w:t>
     </w:r>
     <w:r>
       <w:rPr>
-        <w:sz w:val="22"/>
-        <w:szCs w:val="22"/>
+        <w:sz w:val="20"/>
+        <w:szCs w:val="20"/>
       </w:rPr>
       <w:t xml:space="preserve">DISMISS</w:t>
     </w:r>
     <w:r>
       <w:rPr>
-        <w:sz w:val="22"/>
-        <w:szCs w:val="22"/>
+        <w:sz w:val="20"/>
+        <w:szCs w:val="20"/>
       </w:rPr>
       <w:t xml:space="preserve"> </w:t>
     </w:r>
     <w:r>
       <w:rPr>
-        <w:sz w:val="22"/>
-        <w:szCs w:val="22"/>
+        <w:sz w:val="20"/>
+        <w:szCs w:val="20"/>
       </w:rPr>
       <w:t xml:space="preserve">OR</w:t>
     </w:r>
     <w:r>
       <w:rPr>
-        <w:sz w:val="22"/>
-        <w:szCs w:val="22"/>
+        <w:sz w:val="20"/>
+        <w:szCs w:val="20"/>
       </w:rPr>
       <w:t xml:space="preserve"> </w:t>
     </w:r>
     <w:r>
       <w:rPr>
-        <w:sz w:val="22"/>
-        <w:szCs w:val="22"/>
+        <w:sz w:val="20"/>
+        <w:szCs w:val="20"/>
       </w:rPr>
       <w:t xml:space="preserve">TRANSFER</w:t>
     </w:r>
     <w:r>
       <w:rPr>
-        <w:sz w:val="22"/>
-        <w:szCs w:val="22"/>
+        <w:sz w:val="20"/>
+        <w:szCs w:val="20"/>
       </w:rPr>
       <w:t xml:space="preserve"> </w:t>
     </w:r>
     <w:r>
       <w:rPr>
-        <w:sz w:val="22"/>
-        <w:szCs w:val="22"/>
+        <w:sz w:val="20"/>
+        <w:szCs w:val="20"/>
       </w:rPr>
       <w:t xml:space="preserve">FOR</w:t>
     </w:r>
     <w:r>
       <w:rPr>
-        <w:sz w:val="22"/>
-        <w:szCs w:val="22"/>
+        <w:sz w:val="20"/>
+        <w:szCs w:val="20"/>
       </w:rPr>
       <w:t xml:space="preserve"> </w:t>
     </w:r>
     <w:r>
       <w:rPr>
-        <w:sz w:val="22"/>
-        <w:szCs w:val="22"/>
+        <w:sz w:val="20"/>
+        <w:szCs w:val="20"/>
       </w:rPr>
       <w:t xml:space="preserve">IMPROPER</w:t>
     </w:r>
     <w:r>
       <w:rPr>
-        <w:sz w:val="22"/>
-        <w:szCs w:val="22"/>
+        <w:sz w:val="20"/>
+        <w:szCs w:val="20"/>
       </w:rPr>
       <w:t xml:space="preserve"> </w:t>
     </w:r>
     <w:r>
       <w:rPr>
-        <w:sz w:val="22"/>
-        <w:szCs w:val="22"/>
+        <w:sz w:val="20"/>
+        <w:szCs w:val="20"/>
       </w:rPr>
       <w:t xml:space="preserve">VENUE</w:t>
     </w:r>
     <w:r>
       <w:rPr>
-        <w:sz w:val="22"/>
-        <w:szCs w:val="22"/>
+        <w:sz w:val="20"/>
+        <w:szCs w:val="20"/>
       </w:rPr>
       <w:t xml:space="preserve"> </w:t>
     </w:r>
     <w:r>
       <w:rPr>
-        <w:sz w:val="22"/>
-        <w:szCs w:val="22"/>
+        <w:sz w:val="20"/>
+        <w:szCs w:val="20"/>
       </w:rPr>
       <w:t xml:space="preserve">OR,</w:t>
     </w:r>
     <w:r>
       <w:rPr>
-        <w:sz w:val="22"/>
-        <w:szCs w:val="22"/>
+        <w:sz w:val="20"/>
+        <w:szCs w:val="20"/>
       </w:rPr>
       <w:t xml:space="preserve"> </w:t>
     </w:r>
     <w:r>
       <w:rPr>
-        <w:sz w:val="22"/>
-        <w:szCs w:val="22"/>
+        <w:sz w:val="20"/>
+        <w:szCs w:val="20"/>
       </w:rPr>
       <w:t xml:space="preserve">IN</w:t>
     </w:r>
     <w:r>
       <w:rPr>
-        <w:sz w:val="22"/>
-        <w:szCs w:val="22"/>
+        <w:sz w:val="20"/>
+        <w:szCs w:val="20"/>
       </w:rPr>
       <w:t xml:space="preserve"> </w:t>
     </w:r>
     <w:r>
       <w:rPr>
-        <w:sz w:val="22"/>
-        <w:szCs w:val="22"/>
+        <w:sz w:val="20"/>
+        <w:szCs w:val="20"/>
       </w:rPr>
       <w:t xml:space="preserve">THE</w:t>
     </w:r>
     <w:r>
       <w:rPr>
-        <w:sz w:val="22"/>
-        <w:szCs w:val="22"/>
+        <w:sz w:val="20"/>
+        <w:szCs w:val="20"/>
       </w:rPr>
       <w:t xml:space="preserve"> </w:t>
     </w:r>
     <w:r>
       <w:rPr>
-        <w:sz w:val="22"/>
-        <w:szCs w:val="22"/>
+        <w:sz w:val="20"/>
+        <w:szCs w:val="20"/>
       </w:rPr>
       <w:t xml:space="preserve">ALTERNATIVE,</w:t>
     </w:r>
     <w:r>
       <w:rPr>
-        <w:sz w:val="22"/>
-        <w:szCs w:val="22"/>
+        <w:sz w:val="20"/>
+        <w:szCs w:val="20"/>
       </w:rPr>
       <w:t xml:space="preserve"> </w:t>
     </w:r>
     <w:r>
       <w:rPr>
-        <w:sz w:val="22"/>
-        <w:szCs w:val="22"/>
+        <w:sz w:val="20"/>
+        <w:szCs w:val="20"/>
       </w:rPr>
       <w:t xml:space="preserve">MOTION</w:t>
     </w:r>
     <w:r>
       <w:rPr>
-        <w:sz w:val="22"/>
-        <w:szCs w:val="22"/>
+        <w:sz w:val="20"/>
+        <w:szCs w:val="20"/>
       </w:rPr>
       <w:t xml:space="preserve"> </w:t>
     </w:r>
     <w:r>
       <w:rPr>
-        <w:sz w:val="22"/>
-        <w:szCs w:val="22"/>
+        <w:sz w:val="20"/>
+        <w:szCs w:val="20"/>
       </w:rPr>
       <w:t xml:space="preserve">TO</w:t>
     </w:r>
     <w:r>
       <w:rPr>
-        <w:sz w:val="22"/>
-        <w:szCs w:val="22"/>
+        <w:sz w:val="20"/>
+        <w:szCs w:val="20"/>
       </w:rPr>
       <w:t xml:space="preserve"> </w:t>
     </w:r>
     <w:r>
       <w:rPr>
-        <w:sz w:val="22"/>
-        <w:szCs w:val="22"/>
+        <w:sz w:val="20"/>
+        <w:szCs w:val="20"/>
       </w:rPr>
       <w:t xml:space="preserve">DISMISS</w:t>
     </w:r>
     <w:r>
       <w:rPr>
-        <w:sz w:val="22"/>
-        <w:szCs w:val="22"/>
+        <w:sz w:val="20"/>
+        <w:szCs w:val="20"/>
       </w:rPr>
       <w:t xml:space="preserve"> </w:t>
     </w:r>
     <w:r>
       <w:rPr>
-        <w:sz w:val="22"/>
-        <w:szCs w:val="22"/>
+        <w:sz w:val="20"/>
+        <w:szCs w:val="20"/>
       </w:rPr>
       <w:t xml:space="preserve">FOR</w:t>
     </w:r>
     <w:r>
       <w:rPr>
-        <w:sz w:val="22"/>
-        <w:szCs w:val="22"/>
+        <w:sz w:val="20"/>
+        <w:szCs w:val="20"/>
       </w:rPr>
       <w:t xml:space="preserve"> </w:t>
     </w:r>
     <w:r>
       <w:rPr>
-        <w:sz w:val="22"/>
-        <w:szCs w:val="22"/>
+        <w:sz w:val="20"/>
+        <w:szCs w:val="20"/>
       </w:rPr>
       <w:t xml:space="preserve">FAILURE</w:t>
     </w:r>
     <w:r>
       <w:rPr>
-        <w:sz w:val="22"/>
-        <w:szCs w:val="22"/>
+        <w:sz w:val="20"/>
+        <w:szCs w:val="20"/>
       </w:rPr>
       <w:t xml:space="preserve"> </w:t>
     </w:r>
     <w:r>
       <w:rPr>
-        <w:sz w:val="22"/>
-        <w:szCs w:val="22"/>
+        <w:sz w:val="20"/>
+        <w:szCs w:val="20"/>
       </w:rPr>
       <w:t xml:space="preserve">TO</w:t>
     </w:r>
     <w:r>
       <w:rPr>
-        <w:sz w:val="22"/>
-        <w:szCs w:val="22"/>
+        <w:sz w:val="20"/>
+        <w:szCs w:val="20"/>
       </w:rPr>
       <w:t xml:space="preserve"> </w:t>
     </w:r>
     <w:r>
       <w:rPr>
-        <w:sz w:val="22"/>
-        <w:szCs w:val="22"/>
+        <w:sz w:val="20"/>
+        <w:szCs w:val="20"/>
       </w:rPr>
       <w:t xml:space="preserve">STATE</w:t>
     </w:r>
     <w:r>
       <w:rPr>
-        <w:sz w:val="22"/>
-        <w:szCs w:val="22"/>
+        <w:sz w:val="20"/>
+        <w:szCs w:val="20"/>
       </w:rPr>
       <w:t xml:space="preserve"> </w:t>
     </w:r>
     <w:r>
       <w:rPr>
-        <w:sz w:val="22"/>
-        <w:szCs w:val="22"/>
+        <w:sz w:val="20"/>
+        <w:szCs w:val="20"/>
       </w:rPr>
       <w:t xml:space="preserve">A</w:t>
     </w:r>
     <w:r>
       <w:rPr>
-        <w:sz w:val="22"/>
-        <w:szCs w:val="22"/>
+        <w:sz w:val="20"/>
+        <w:szCs w:val="20"/>
       </w:rPr>
       <w:t xml:space="preserve"> </w:t>
     </w:r>
     <w:r>
       <w:rPr>
-        <w:sz w:val="22"/>
-        <w:szCs w:val="22"/>
+        <w:sz w:val="20"/>
+        <w:szCs w:val="20"/>
       </w:rPr>
       <w:t xml:space="preserve">CLAIM</w:t>
     </w:r>
   </w:p>
   <w:p>
     <w:pPr>
-      <w:spacing w:before="0" w:after="0" w:line="253" w:lineRule="exact"/>
+      <w:spacing w:before="0" w:after="0" w:line="230" w:lineRule="exact"/>
       <w:ind w:left="0" w:firstLine="0"/>
       <w:jc w:val="center"/>
     </w:pPr>
     <w:r>
       <w:rPr>
-        <w:sz w:val="22"/>
-        <w:szCs w:val="22"/>
+        <w:sz w:val="20"/>
+        <w:szCs w:val="20"/>
       </w:rPr>
-      <w:t xml:space="preserve">No. 16-cv</w:t>
-      <w:noBreakHyphen/>
-      <w:t xml:space="preserve">7189-LB</w:t>
+      <w:t xml:space="preserve">No. 16-cv-⁠7189-LB</w:t>
+    </w:r>
+  </w:p>
+</w:ftr>
+</file>
+
+<file path=word/ftr-own2.xml><?xml version="1.0" encoding="utf-8"?>
+<w:ftr xmlns:w="http://schemas.openxmlformats.org/wordprocessingml/2006/main" xmlns:r="http://schemas.openxmlformats.org/officeDocument/2006/relationships">
+  <w:p>
+    <w:pPr>
+      <w:spacing w:before="0" w:after="0" w:line="20" w:lineRule="exact"/>
+    </w:pPr>
+    <w:r>
+      <w:pict xmlns:v="urn:schemas-microsoft-com:vml" xmlns:o="urn:schemas-microsoft-com:office:office">
+        <v:shape id="CandLineNumbers" filled="f" stroked="f" style="position:absolute;mso-position-horizontal:absolute;mso-position-horizontal-relative:page;mso-position-vertical:absolute;mso-position-vertical-relative:page;margin-left:4pt;margin-top:55.75pt;width:72.0pt;height:684.0pt;z-index:-251658752">
+          <v:textbox inset="0pt,0pt,0pt,0pt">
+            <w:txbxContent>
+              <w:p>
+                <w:pPr>
+                  <w:spacing w:before="0" w:after="0" w:line="480" w:lineRule="exact"/>
+                  <w:ind w:left="0" w:firstLine="0"/>
+                  <w:jc w:val="right"/>
+                </w:pPr>
+                <w:r>
+                  <w:t xml:space="preserve">1</w:t>
+                </w:r>
+              </w:p>
+              <w:p>
+                <w:pPr>
+                  <w:spacing w:before="0" w:after="0" w:line="480" w:lineRule="exact"/>
+                  <w:ind w:left="0" w:firstLine="0"/>
+                  <w:jc w:val="right"/>
+                </w:pPr>
+                <w:r>
+                  <w:t xml:space="preserve">2</w:t>
+                </w:r>
+              </w:p>
+              <w:p>
+                <w:pPr>
+                  <w:spacing w:before="0" w:after="0" w:line="480" w:lineRule="exact"/>
+                  <w:ind w:left="0" w:firstLine="0"/>
+                  <w:jc w:val="right"/>
+                </w:pPr>
+                <w:r>
+                  <w:t xml:space="preserve">3</w:t>
+                </w:r>
+              </w:p>
+              <w:p>
+                <w:pPr>
+                  <w:spacing w:before="0" w:after="0" w:line="480" w:lineRule="exact"/>
+                  <w:ind w:left="0" w:firstLine="0"/>
+                  <w:jc w:val="right"/>
+                </w:pPr>
+                <w:r>
+                  <w:t xml:space="preserve">4</w:t>
+                </w:r>
+              </w:p>
+              <w:p>
+                <w:pPr>
+                  <w:spacing w:before="0" w:after="0" w:line="480" w:lineRule="exact"/>
+                  <w:ind w:left="0" w:firstLine="0"/>
+                  <w:jc w:val="right"/>
+                </w:pPr>
+                <w:r>
+                  <w:t xml:space="preserve">5</w:t>
+                </w:r>
+              </w:p>
+              <w:p>
+                <w:pPr>
+                  <w:spacing w:before="0" w:after="0" w:line="480" w:lineRule="exact"/>
+                  <w:ind w:left="0" w:firstLine="0"/>
+                  <w:jc w:val="right"/>
+                </w:pPr>
+                <w:r>
+                  <w:t xml:space="preserve">6</w:t>
+                </w:r>
+              </w:p>
+              <w:p>
+                <w:pPr>
+                  <w:spacing w:before="0" w:after="0" w:line="480" w:lineRule="exact"/>
+                  <w:ind w:left="0" w:firstLine="0"/>
+                  <w:jc w:val="right"/>
+                </w:pPr>
+                <w:r>
+                  <w:t xml:space="preserve">7</w:t>
+                </w:r>
+              </w:p>
+              <w:p>
+                <w:pPr>
+                  <w:spacing w:before="0" w:after="0" w:line="480" w:lineRule="exact"/>
+                  <w:ind w:left="0" w:firstLine="0"/>
+                  <w:jc w:val="right"/>
+                </w:pPr>
+                <w:r>
+                  <w:t xml:space="preserve">8</w:t>
+                </w:r>
+              </w:p>
+              <w:p>
+                <w:pPr>
+                  <w:spacing w:before="0" w:after="0" w:line="480" w:lineRule="exact"/>
+                  <w:ind w:left="0" w:firstLine="0"/>
+                  <w:jc w:val="right"/>
+                </w:pPr>
+                <w:r>
+                  <w:t xml:space="preserve">9</w:t>
+                </w:r>
+              </w:p>
+              <w:p>
+                <w:pPr>
+                  <w:spacing w:before="0" w:after="0" w:line="480" w:lineRule="exact"/>
+                  <w:ind w:left="0" w:firstLine="0"/>
+                  <w:jc w:val="right"/>
+                </w:pPr>
+                <w:r>
+                  <w:t xml:space="preserve">10</w:t>
+                </w:r>
+              </w:p>
+              <w:p>
+                <w:pPr>
+                  <w:spacing w:before="0" w:after="0" w:line="480" w:lineRule="exact"/>
+                  <w:ind w:left="0" w:firstLine="0"/>
+                  <w:jc w:val="right"/>
+                </w:pPr>
+                <w:r>
+                  <w:t xml:space="preserve">11</w:t>
+                </w:r>
+              </w:p>
+              <w:p>
+                <w:pPr>
+                  <w:spacing w:before="0" w:after="0" w:line="480" w:lineRule="exact"/>
+                  <w:ind w:left="0" w:firstLine="0"/>
+                  <w:jc w:val="right"/>
+                </w:pPr>
+                <w:r>
+                  <w:t xml:space="preserve">12</w:t>
+                </w:r>
+              </w:p>
+              <w:p>
+                <w:pPr>
+                  <w:spacing w:before="0" w:after="0" w:line="480" w:lineRule="exact"/>
+                  <w:ind w:left="0" w:firstLine="0"/>
+                  <w:jc w:val="right"/>
+                </w:pPr>
+                <w:r>
+                  <w:t xml:space="preserve">13</w:t>
+                </w:r>
+              </w:p>
+              <w:p>
+                <w:pPr>
+                  <w:spacing w:before="0" w:after="0" w:line="480" w:lineRule="exact"/>
+                  <w:ind w:left="0" w:firstLine="0"/>
+                  <w:jc w:val="right"/>
+                </w:pPr>
+                <w:r>
+                  <w:t xml:space="preserve">14</w:t>
+                </w:r>
+              </w:p>
+              <w:p>
+                <w:pPr>
+                  <w:spacing w:before="0" w:after="0" w:line="480" w:lineRule="exact"/>
+                  <w:ind w:left="0" w:firstLine="0"/>
+                  <w:jc w:val="right"/>
+                </w:pPr>
+                <w:r>
+                  <w:t xml:space="preserve">15</w:t>
+                </w:r>
+              </w:p>
+              <w:p>
+                <w:pPr>
+                  <w:spacing w:before="0" w:after="0" w:line="480" w:lineRule="exact"/>
+                  <w:ind w:left="0" w:firstLine="0"/>
+                  <w:jc w:val="right"/>
+                </w:pPr>
+                <w:r>
+                  <w:t xml:space="preserve">16</w:t>
+                </w:r>
+              </w:p>
+              <w:p>
+                <w:pPr>
+                  <w:spacing w:before="0" w:after="0" w:line="480" w:lineRule="exact"/>
+                  <w:ind w:left="0" w:firstLine="0"/>
+                  <w:jc w:val="right"/>
+                </w:pPr>
+                <w:r>
+                  <w:t xml:space="preserve">17</w:t>
+                </w:r>
+              </w:p>
+              <w:p>
+                <w:pPr>
+                  <w:spacing w:before="0" w:after="0" w:line="480" w:lineRule="exact"/>
+                  <w:ind w:left="0" w:firstLine="0"/>
+                  <w:jc w:val="right"/>
+                </w:pPr>
+                <w:r>
+                  <w:t xml:space="preserve">18</w:t>
+                </w:r>
+              </w:p>
+              <w:p>
+                <w:pPr>
+                  <w:spacing w:before="0" w:after="0" w:line="480" w:lineRule="exact"/>
+                  <w:ind w:left="0" w:firstLine="0"/>
+                  <w:jc w:val="right"/>
+                </w:pPr>
+                <w:r>
+                  <w:t xml:space="preserve">19</w:t>
+                </w:r>
+              </w:p>
+              <w:p>
+                <w:pPr>
+                  <w:spacing w:before="0" w:after="0" w:line="480" w:lineRule="exact"/>
+                  <w:ind w:left="0" w:firstLine="0"/>
+                  <w:jc w:val="right"/>
+                </w:pPr>
+                <w:r>
+                  <w:t xml:space="preserve">20</w:t>
+                </w:r>
+              </w:p>
+              <w:p>
+                <w:pPr>
+                  <w:spacing w:before="0" w:after="0" w:line="480" w:lineRule="exact"/>
+                  <w:ind w:left="0" w:firstLine="0"/>
+                  <w:jc w:val="right"/>
+                </w:pPr>
+                <w:r>
+                  <w:t xml:space="preserve">21</w:t>
+                </w:r>
+              </w:p>
+              <w:p>
+                <w:pPr>
+                  <w:spacing w:before="0" w:after="0" w:line="480" w:lineRule="exact"/>
+                  <w:ind w:left="0" w:firstLine="0"/>
+                  <w:jc w:val="right"/>
+                </w:pPr>
+                <w:r>
+                  <w:t xml:space="preserve">22</w:t>
+                </w:r>
+              </w:p>
+              <w:p>
+                <w:pPr>
+                  <w:spacing w:before="0" w:after="0" w:line="480" w:lineRule="exact"/>
+                  <w:ind w:left="0" w:firstLine="0"/>
+                  <w:jc w:val="right"/>
+                </w:pPr>
+                <w:r>
+                  <w:t xml:space="preserve">23</w:t>
+                </w:r>
+              </w:p>
+              <w:p>
+                <w:pPr>
+                  <w:spacing w:before="0" w:after="0" w:line="480" w:lineRule="exact"/>
+                  <w:ind w:left="0" w:firstLine="0"/>
+                  <w:jc w:val="right"/>
+                </w:pPr>
+                <w:r>
+                  <w:t xml:space="preserve">24</w:t>
+                </w:r>
+              </w:p>
+              <w:p>
+                <w:pPr>
+                  <w:spacing w:before="0" w:after="0" w:line="480" w:lineRule="exact"/>
+                  <w:ind w:left="0" w:firstLine="0"/>
+                  <w:jc w:val="right"/>
+                </w:pPr>
+                <w:r>
+                  <w:t xml:space="preserve">25</w:t>
+                </w:r>
+              </w:p>
+              <w:p>
+                <w:pPr>
+                  <w:spacing w:before="0" w:after="0" w:line="480" w:lineRule="exact"/>
+                  <w:ind w:left="0" w:firstLine="0"/>
+                  <w:jc w:val="right"/>
+                </w:pPr>
+                <w:r>
+                  <w:t xml:space="preserve">26</w:t>
+                </w:r>
+              </w:p>
+              <w:p>
+                <w:pPr>
+                  <w:spacing w:before="0" w:after="0" w:line="480" w:lineRule="exact"/>
+                  <w:ind w:left="0" w:firstLine="0"/>
+                  <w:jc w:val="right"/>
+                </w:pPr>
+                <w:r>
+                  <w:t xml:space="preserve">27</w:t>
+                </w:r>
+              </w:p>
+              <w:p>
+                <w:pPr>
+                  <w:spacing w:before="0" w:after="0" w:line="480" w:lineRule="exact"/>
+                  <w:ind w:left="0" w:firstLine="0"/>
+                  <w:jc w:val="right"/>
+                </w:pPr>
+                <w:r>
+                  <w:t xml:space="preserve">28</w:t>
+                </w:r>
+              </w:p>
+            </w:txbxContent>
+          </v:textbox>
+        </v:shape>
+      </w:pict>
+    </w:r>
+    <w:r>
+      <w:pict xmlns:v="urn:schemas-microsoft-com:vml" xmlns:o="urn:schemas-microsoft-com:office:office">
+        <v:rect id="CandRule1" fillcolor="black" filled="t" stroked="f" style="position:absolute;mso-position-horizontal:absolute;mso-position-horizontal-relative:page;mso-position-vertical:absolute;mso-position-vertical-relative:page;margin-left:93.23pt;margin-top:0;width:0.75pt;height:792pt;z-index:-251658701"/>
+      </w:pict>
+    </w:r>
+    <w:r>
+      <w:pict xmlns:v="urn:schemas-microsoft-com:vml" xmlns:o="urn:schemas-microsoft-com:office:office">
+        <v:rect id="CandRule2" fillcolor="black" filled="t" stroked="f" style="position:absolute;mso-position-horizontal:absolute;mso-position-horizontal-relative:page;mso-position-vertical:absolute;mso-position-vertical-relative:page;margin-left:96.11pt;margin-top:0;width:0.75pt;height:792pt;z-index:-251658702"/>
+      </w:pict>
+    </w:r>
+    <w:r>
+      <w:pict xmlns:v="urn:schemas-microsoft-com:vml" xmlns:o="urn:schemas-microsoft-com:office:office">
+        <v:rect id="CandRule3" fillcolor="black" filled="t" stroked="f" style="position:absolute;mso-position-horizontal:absolute;mso-position-horizontal-relative:page;mso-position-vertical:absolute;mso-position-vertical-relative:page;margin-left:546.82pt;margin-top:0;width:0.75pt;height:792pt;z-index:-251658703"/>
+      </w:pict>
     </w:r>
   </w:p>
 </w:ftr>
@@ -7144,7 +7707,7 @@
     <w:pPr>
       <w:keepNext/>
       <w:keepLines/>
-      <w:spacing w:before="240" w:after="240" w:line="276" w:lineRule="exact"/>
+      <w:spacing w:before="240" w:after="240" w:line="240" w:lineRule="exact"/>
       <w:ind w:firstLine="0"/>
       <w:jc w:val="center"/>
       <w:outlineLvl w:val="0"/>
@@ -7172,7 +7735,7 @@
     <w:pPr>
       <w:keepNext/>
       <w:keepLines/>
-      <w:spacing w:before="240" w:after="240" w:line="276" w:lineRule="exact"/>
+      <w:spacing w:before="240" w:after="240" w:line="240" w:lineRule="exact"/>
       <w:ind w:firstLine="0"/>
       <w:outlineLvl w:val="1"/>
     </w:pPr>
@@ -7198,7 +7761,7 @@
     <w:pPr>
       <w:keepNext/>
       <w:keepLines/>
-      <w:spacing w:before="240" w:after="240" w:line="276" w:lineRule="exact"/>
+      <w:spacing w:before="240" w:after="240" w:line="240" w:lineRule="exact"/>
       <w:ind w:firstLine="0"/>
       <w:outlineLvl w:val="2"/>
     </w:pPr>
@@ -7224,7 +7787,7 @@
     <w:pPr>
       <w:keepNext/>
       <w:keepLines/>
-      <w:spacing w:before="240" w:after="240" w:line="276" w:lineRule="exact"/>
+      <w:spacing w:before="240" w:after="240" w:line="240" w:lineRule="exact"/>
       <w:ind w:firstLine="0"/>
       <w:outlineLvl w:val="3"/>
     </w:pPr>
@@ -7251,7 +7814,7 @@
     <w:pPr>
       <w:keepNext/>
       <w:keepLines/>
-      <w:spacing w:before="240" w:after="240" w:line="276" w:lineRule="exact"/>
+      <w:spacing w:before="240" w:after="240" w:line="240" w:lineRule="exact"/>
       <w:ind w:firstLine="0"/>
       <w:outlineLvl w:val="4"/>
     </w:pPr>
@@ -7489,7 +8052,7 @@
     <w:unhideWhenUsed/>
     <w:qFormat/>
     <w:pPr>
-      <w:spacing w:before="280" w:after="280" w:line="276" w:lineRule="exact"/>
+      <w:spacing w:before="280" w:after="280" w:line="240" w:lineRule="exact"/>
       <w:ind w:firstLine="0" w:left="720" w:right="720"/>
     </w:pPr>
   </w:style>
@@ -7502,7 +8065,7 @@
     <w:qFormat/>
     <w:pPr>
       <w:keepLines/>
-      <w:spacing w:before="0" w:after="140" w:line="276" w:lineRule="exact"/>
+      <w:spacing w:before="0" w:after="140" w:line="240" w:lineRule="exact"/>
     </w:pPr>
     <w:rPr>
       <w:sz w:val="24"/>

</xml_diff>